<commit_message>
retificacao da introducao e adicao de bibliografias
</commit_message>
<xml_diff>
--- a/RELATORIO/RELATORIO WORD.docx
+++ b/RELATORIO/RELATORIO WORD.docx
@@ -181,48 +181,22 @@
     <w:p>
       <w:pPr>
         <w:spacing w:line="360" w:lineRule="auto"/>
-        <w:jc w:val="center"/>
-        <w:rPr>
-          <w:rFonts w:ascii="Arial" w:hAnsi="Arial" w:cs="Arial"/>
-          <w:b/>
-          <w:bCs/>
-          <w:sz w:val="28"/>
-          <w:szCs w:val="28"/>
-          <w:lang w:val="pt-PT"/>
-        </w:rPr>
-      </w:pPr>
-      <w:r>
-        <w:rPr>
-          <w:rFonts w:ascii="Arial" w:hAnsi="Arial" w:cs="Arial"/>
-          <w:b/>
-          <w:bCs/>
-          <w:sz w:val="28"/>
-          <w:szCs w:val="28"/>
-          <w:lang w:val="pt-PT"/>
-        </w:rPr>
-        <w:t xml:space="preserve">DESENVOLVIMENTO DE UMA PLATAFORMA DIGITAL B2B PARA GESTÃO DE CONCURSOS PRIVADOS E CONTRATAÇÃO </w:t>
-      </w:r>
-      <w:r>
-        <w:rPr>
-          <w:rFonts w:ascii="Arial" w:hAnsi="Arial" w:cs="Arial"/>
-          <w:b/>
-          <w:bCs/>
-          <w:sz w:val="28"/>
-          <w:szCs w:val="28"/>
-          <w:lang w:val="pt-PT"/>
-        </w:rPr>
-        <w:t>PARA</w:t>
-      </w:r>
-      <w:r>
-        <w:rPr>
-          <w:rFonts w:ascii="Arial" w:hAnsi="Arial" w:cs="Arial"/>
-          <w:b/>
-          <w:bCs/>
-          <w:sz w:val="28"/>
-          <w:szCs w:val="28"/>
-          <w:lang w:val="pt-PT"/>
-        </w:rPr>
-        <w:t xml:space="preserve"> PEQUENAS E MÉDIAS EMPRESAS EM ANGOLA</w:t>
+        <w:jc w:val="both"/>
+        <w:rPr>
+          <w:rFonts w:ascii="Arial" w:hAnsi="Arial" w:cs="Arial"/>
+          <w:b/>
+          <w:bCs/>
+          <w:lang w:val="pt-PT"/>
+        </w:rPr>
+      </w:pPr>
+      <w:r>
+        <w:rPr>
+          <w:rFonts w:ascii="Arial" w:hAnsi="Arial" w:cs="Arial"/>
+          <w:b/>
+          <w:bCs/>
+          <w:lang w:val="pt-PT"/>
+        </w:rPr>
+        <w:t>DESENVOLVIMENTO DE UMA PLATAFORMA DIGITAL B2B PARA GESTÃO DE CONCURSOS PRIVADOS E CONTRATAÇÃO PARA PEQUENAS E MÉDIAS EMPRESAS EM ANGOLA</w:t>
       </w:r>
     </w:p>
     <w:p>
@@ -509,6 +483,54 @@
     <w:p>
       <w:pPr>
         <w:spacing w:line="360" w:lineRule="auto"/>
+        <w:jc w:val="both"/>
+        <w:rPr>
+          <w:rFonts w:ascii="Arial" w:hAnsi="Arial" w:cs="Arial"/>
+          <w:b/>
+          <w:bCs/>
+          <w:lang w:val="pt-PT"/>
+        </w:rPr>
+      </w:pPr>
+      <w:r>
+        <w:rPr>
+          <w:rFonts w:ascii="Arial" w:hAnsi="Arial" w:cs="Arial"/>
+          <w:b/>
+          <w:bCs/>
+          <w:lang w:val="pt-PT"/>
+        </w:rPr>
+        <w:t xml:space="preserve">DESENVOLVIMENTO DE </w:t>
+      </w:r>
+      <w:r>
+        <w:rPr>
+          <w:rFonts w:ascii="Arial" w:hAnsi="Arial" w:cs="Arial"/>
+          <w:b/>
+          <w:bCs/>
+          <w:lang w:val="pt-PT"/>
+        </w:rPr>
+        <w:t xml:space="preserve">UMA PLATAFORMA DIGITAL B2B PARA GESTÃO DE CONCURSOS PRIVADOS E CONTRATAÇÃO </w:t>
+      </w:r>
+      <w:r>
+        <w:rPr>
+          <w:rFonts w:ascii="Arial" w:hAnsi="Arial" w:cs="Arial"/>
+          <w:b/>
+          <w:bCs/>
+          <w:lang w:val="pt-PT"/>
+        </w:rPr>
+        <w:t>PARA</w:t>
+      </w:r>
+      <w:r>
+        <w:rPr>
+          <w:rFonts w:ascii="Arial" w:hAnsi="Arial" w:cs="Arial"/>
+          <w:b/>
+          <w:bCs/>
+          <w:lang w:val="pt-PT"/>
+        </w:rPr>
+        <w:t xml:space="preserve"> PEQUENAS E MÉDIAS EMPRESAS EM ANGOLA</w:t>
+      </w:r>
+    </w:p>
+    <w:p>
+      <w:pPr>
+        <w:spacing w:line="360" w:lineRule="auto"/>
         <w:jc w:val="center"/>
         <w:rPr>
           <w:rFonts w:ascii="Arial" w:hAnsi="Arial" w:cs="Arial"/>
@@ -517,42 +539,6 @@
           <w:lang w:val="pt-PT"/>
         </w:rPr>
       </w:pPr>
-      <w:r>
-        <w:rPr>
-          <w:rFonts w:ascii="Arial" w:hAnsi="Arial" w:cs="Arial"/>
-          <w:b/>
-          <w:bCs/>
-          <w:lang w:val="pt-PT"/>
-        </w:rPr>
-        <w:t xml:space="preserve">DESENVOLVIMENTO DE </w:t>
-      </w:r>
-      <w:r>
-        <w:rPr>
-          <w:rFonts w:ascii="Arial" w:hAnsi="Arial" w:cs="Arial"/>
-          <w:b/>
-          <w:bCs/>
-          <w:lang w:val="pt-PT"/>
-        </w:rPr>
-        <w:t xml:space="preserve">UMA PLATAFORMA DIGITAL B2B PARA GESTÃO DE CONCURSOS PRIVADOS E CONTRATAÇÃO </w:t>
-      </w:r>
-      <w:r>
-        <w:rPr>
-          <w:rFonts w:ascii="Arial" w:hAnsi="Arial" w:cs="Arial"/>
-          <w:b/>
-          <w:bCs/>
-          <w:lang w:val="pt-PT"/>
-        </w:rPr>
-        <w:t>PARA</w:t>
-      </w:r>
-      <w:r>
-        <w:rPr>
-          <w:rFonts w:ascii="Arial" w:hAnsi="Arial" w:cs="Arial"/>
-          <w:b/>
-          <w:bCs/>
-          <w:lang w:val="pt-PT"/>
-        </w:rPr>
-        <w:t xml:space="preserve"> PEQUENAS E MÉDIAS EMPRESAS EM ANGOLA</w:t>
-      </w:r>
     </w:p>
     <w:p>
       <w:pPr>
@@ -757,23 +743,7 @@
           <w:rFonts w:ascii="Arial" w:hAnsi="Arial" w:cs="Arial"/>
           <w:lang w:val="pt-PT"/>
         </w:rPr>
-        <w:t xml:space="preserve">: </w:t>
-      </w:r>
-      <w:proofErr w:type="spellStart"/>
-      <w:r>
-        <w:rPr>
-          <w:rFonts w:ascii="Arial" w:hAnsi="Arial" w:cs="Arial"/>
-          <w:lang w:val="pt-PT"/>
-        </w:rPr>
-        <w:t>Msc</w:t>
-      </w:r>
-      <w:proofErr w:type="spellEnd"/>
-      <w:r>
-        <w:rPr>
-          <w:rFonts w:ascii="Arial" w:hAnsi="Arial" w:cs="Arial"/>
-          <w:lang w:val="pt-PT"/>
-        </w:rPr>
-        <w:t>. Lírio Ramalheira</w:t>
+        <w:t>: Msc. Lírio Ramalheira</w:t>
       </w:r>
     </w:p>
     <w:p>
@@ -818,6 +788,7 @@
           <w:noProof/>
           <w:lang w:val="pt-PT"/>
         </w:rPr>
+        <w:lastRenderedPageBreak/>
         <mc:AlternateContent>
           <mc:Choice Requires="wps">
             <w:drawing>
@@ -3827,7 +3798,7 @@
           <w:rFonts w:ascii="Arial" w:hAnsi="Arial" w:cs="Arial"/>
           <w:lang w:val="pt-PT"/>
         </w:rPr>
-        <w:t xml:space="preserve">A crescente digitalização dos processos organizacionais tem vindo a transformar de forma significativa a maneira como as empresas interagem, negociam e estabelecem relações comerciais. </w:t>
+        <w:t>Numa economia global cada vez mais competitiva, existe uma pressão constante para que as empresas optimizem as suas operações: necessitam não apenas de vender mais, mas, fundamentalmente, de comprar melhor. Contudo, a integração de soluções tecnológicas na cadeia de fornecimentos surge como alternativa rentável através da adopção do conceito de e-procurement.</w:t>
       </w:r>
     </w:p>
     <w:p>
@@ -3837,43 +3808,49 @@
         <w:jc w:val="both"/>
         <w:rPr>
           <w:rFonts w:ascii="Arial" w:hAnsi="Arial" w:cs="Arial"/>
-          <w:lang w:val="pt-PT"/>
-        </w:rPr>
-      </w:pPr>
-      <w:r>
-        <w:rPr>
-          <w:rFonts w:ascii="Arial" w:hAnsi="Arial" w:cs="Arial"/>
-          <w:lang w:val="pt-PT"/>
-        </w:rPr>
-        <w:t>No contexto das pequenas e médias empresas (PME</w:t>
-      </w:r>
-      <w:r>
-        <w:rPr>
-          <w:rFonts w:ascii="Arial" w:hAnsi="Arial" w:cs="Arial"/>
-          <w:lang w:val="pt-PT"/>
-        </w:rPr>
-        <w:t>s</w:t>
-      </w:r>
-      <w:r>
-        <w:rPr>
-          <w:rFonts w:ascii="Arial" w:hAnsi="Arial" w:cs="Arial"/>
-          <w:lang w:val="pt-PT"/>
-        </w:rPr>
-        <w:t>), o uso de plataformas digitais assume um papel estratégico, uma vez que estas organizações enfrentam limitações estruturais, financeiras e informacionais que dificultam o acesso a oportunidades de negócio e a gestão eficiente dos seus processos internos. Em economias em desenvolvimento, como a</w:t>
-      </w:r>
-      <w:r>
-        <w:rPr>
-          <w:rFonts w:ascii="Arial" w:hAnsi="Arial" w:cs="Arial"/>
-          <w:lang w:val="pt-PT"/>
-        </w:rPr>
-        <w:t xml:space="preserve"> nossa</w:t>
-      </w:r>
-      <w:r>
-        <w:rPr>
-          <w:rFonts w:ascii="Arial" w:hAnsi="Arial" w:cs="Arial"/>
-          <w:lang w:val="pt-PT"/>
-        </w:rPr>
-        <w:t xml:space="preserve"> angolana, essas limitações tendem a ser ainda mais acentuadas, reforçando a necessidade de soluções tecnológicas adaptadas à realidade local. </w:t>
+        </w:rPr>
+      </w:pPr>
+      <w:r>
+        <w:rPr>
+          <w:rFonts w:ascii="Arial" w:hAnsi="Arial" w:cs="Arial"/>
+        </w:rPr>
+        <w:t>Segundo Amaral, Teixeira e Oliveira (2003)</w:t>
+      </w:r>
+      <w:r>
+        <w:rPr>
+          <w:rFonts w:ascii="Arial" w:hAnsi="Arial" w:cs="Arial"/>
+        </w:rPr>
+        <w:t>, a</w:t>
+      </w:r>
+      <w:r>
+        <w:rPr>
+          <w:rFonts w:ascii="Arial" w:hAnsi="Arial" w:cs="Arial"/>
+        </w:rPr>
+        <w:t xml:space="preserve"> actividade de </w:t>
+      </w:r>
+      <w:r>
+        <w:rPr>
+          <w:rFonts w:ascii="Arial" w:hAnsi="Arial" w:cs="Arial"/>
+        </w:rPr>
+        <w:t>e-</w:t>
+      </w:r>
+      <w:r>
+        <w:rPr>
+          <w:rFonts w:ascii="Arial" w:hAnsi="Arial" w:cs="Arial"/>
+        </w:rPr>
+        <w:t>procurement numa qualquer organização abarca todas as actividades associadas ao processo de aquisição de bens ou serviços necessários para a realização dos processos produtivos e de gestão</w:t>
+      </w:r>
+      <w:r>
+        <w:rPr>
+          <w:rFonts w:ascii="Arial" w:hAnsi="Arial" w:cs="Arial"/>
+        </w:rPr>
+        <w:t xml:space="preserve"> utilizando tecnologia de informação</w:t>
+      </w:r>
+      <w:r>
+        <w:rPr>
+          <w:rFonts w:ascii="Arial" w:hAnsi="Arial" w:cs="Arial"/>
+        </w:rPr>
+        <w:t>, que, por sua vez, levarão à criação de valor acrescentado nos produtos e serviços que são colocas no mercado.</w:t>
       </w:r>
     </w:p>
     <w:p>
@@ -3891,109 +3868,7 @@
           <w:rFonts w:ascii="Arial" w:hAnsi="Arial" w:cs="Arial"/>
           <w:lang w:val="pt-PT"/>
         </w:rPr>
-        <w:t>No se</w:t>
-      </w:r>
-      <w:r>
-        <w:rPr>
-          <w:rFonts w:ascii="Arial" w:hAnsi="Arial" w:cs="Arial"/>
-          <w:lang w:val="pt-PT"/>
-        </w:rPr>
-        <w:t>c</w:t>
-      </w:r>
-      <w:r>
-        <w:rPr>
-          <w:rFonts w:ascii="Arial" w:hAnsi="Arial" w:cs="Arial"/>
-          <w:lang w:val="pt-PT"/>
-        </w:rPr>
-        <w:t xml:space="preserve">tor privado, é comum que empresas recorram a concursos privados e processos competitivos para a aquisição de bens, serviços ou execução de </w:t>
-      </w:r>
-      <w:proofErr w:type="spellStart"/>
-      <w:r>
-        <w:rPr>
-          <w:rFonts w:ascii="Arial" w:hAnsi="Arial" w:cs="Arial"/>
-          <w:lang w:val="pt-PT"/>
-        </w:rPr>
-        <w:t>proje</w:t>
-      </w:r>
-      <w:r>
-        <w:rPr>
-          <w:rFonts w:ascii="Arial" w:hAnsi="Arial" w:cs="Arial"/>
-          <w:lang w:val="pt-PT"/>
-        </w:rPr>
-        <w:t>c</w:t>
-      </w:r>
-      <w:r>
-        <w:rPr>
-          <w:rFonts w:ascii="Arial" w:hAnsi="Arial" w:cs="Arial"/>
-          <w:lang w:val="pt-PT"/>
-        </w:rPr>
-        <w:t>tos</w:t>
-      </w:r>
-      <w:proofErr w:type="spellEnd"/>
-      <w:r>
-        <w:rPr>
-          <w:rFonts w:ascii="Arial" w:hAnsi="Arial" w:cs="Arial"/>
-          <w:lang w:val="pt-PT"/>
-        </w:rPr>
-        <w:t xml:space="preserve">, com o </w:t>
-      </w:r>
-      <w:proofErr w:type="spellStart"/>
-      <w:r>
-        <w:rPr>
-          <w:rFonts w:ascii="Arial" w:hAnsi="Arial" w:cs="Arial"/>
-          <w:lang w:val="pt-PT"/>
-        </w:rPr>
-        <w:t>obje</w:t>
-      </w:r>
-      <w:r>
-        <w:rPr>
-          <w:rFonts w:ascii="Arial" w:hAnsi="Arial" w:cs="Arial"/>
-          <w:lang w:val="pt-PT"/>
-        </w:rPr>
-        <w:t>c</w:t>
-      </w:r>
-      <w:r>
-        <w:rPr>
-          <w:rFonts w:ascii="Arial" w:hAnsi="Arial" w:cs="Arial"/>
-          <w:lang w:val="pt-PT"/>
-        </w:rPr>
-        <w:t>tivo</w:t>
-      </w:r>
-      <w:proofErr w:type="spellEnd"/>
-      <w:r>
-        <w:rPr>
-          <w:rFonts w:ascii="Arial" w:hAnsi="Arial" w:cs="Arial"/>
-          <w:lang w:val="pt-PT"/>
-        </w:rPr>
-        <w:t xml:space="preserve"> de selecionar propostas mais vantajosas sob critérios técnicos, financeiros e operacionais. Contudo, muitas PME</w:t>
-      </w:r>
-      <w:r>
-        <w:rPr>
-          <w:rFonts w:ascii="Arial" w:hAnsi="Arial" w:cs="Arial"/>
-          <w:lang w:val="pt-PT"/>
-        </w:rPr>
-        <w:t>s</w:t>
-      </w:r>
-      <w:r>
-        <w:rPr>
-          <w:rFonts w:ascii="Arial" w:hAnsi="Arial" w:cs="Arial"/>
-          <w:lang w:val="pt-PT"/>
-        </w:rPr>
-        <w:t xml:space="preserve"> enfrentam dificuldades tanto na divulgação dessas oportunidades quanto no acompanhamento e gestão das candidaturas, devido à fragmentação da informação, à ausência de plataformas integradas e à dependência de meios informais de comunicação</w:t>
-      </w:r>
-      <w:r>
-        <w:rPr>
-          <w:rFonts w:ascii="Arial" w:hAnsi="Arial" w:cs="Arial"/>
-          <w:lang w:val="pt-PT"/>
-        </w:rPr>
-        <w:t>, muitos deles até formais, mas custoso demais para as empresas</w:t>
-      </w:r>
-      <w:r>
-        <w:rPr>
-          <w:rFonts w:ascii="Arial" w:hAnsi="Arial" w:cs="Arial"/>
-          <w:lang w:val="pt-PT"/>
-        </w:rPr>
-        <w:t xml:space="preserve">. </w:t>
+        <w:t>Quando o foco se vira para as Pequenas e Médias Empresas (PMEs) na relação de contratação estritamente corporativa Business-to-Business (B2B), a realidade processual e operacional é caracterizada por informalidade, descentralização e assimetria de informação. Muitas PMEs angolanas debatem-se perante grandes dificuldades na divulgação transparente de concursos privados e na captação eficiente de candidaturas; a selecção de fornecedores assenta ainda em métodos fragmentados cuja gestão manual resulta frequentemente na perda de oportunidades e no empobrecimento competitivo (tanto de quem adquire, quanto de quem submete as propostas).</w:t>
       </w:r>
     </w:p>
     <w:p>
@@ -4003,29 +3878,46 @@
         <w:jc w:val="both"/>
         <w:rPr>
           <w:rFonts w:ascii="Arial" w:hAnsi="Arial" w:cs="Arial"/>
-          <w:lang w:val="pt-PT"/>
-        </w:rPr>
-      </w:pPr>
-      <w:r>
-        <w:rPr>
-          <w:rFonts w:ascii="Arial" w:hAnsi="Arial" w:cs="Arial"/>
-          <w:lang w:val="pt-PT"/>
-        </w:rPr>
-        <w:t>Por outro lado, empresas interessadas em fornecer produtos ou serviços frequentemente não chegam a tomar conhecimento dessas oportunidades, perdendo potenciais contratos por falta de acesso à informação adequada</w:t>
-      </w:r>
-      <w:r>
-        <w:rPr>
-          <w:rFonts w:ascii="Arial" w:hAnsi="Arial" w:cs="Arial"/>
-          <w:lang w:val="pt-PT"/>
-        </w:rPr>
-        <w:t xml:space="preserve"> e oportuna</w:t>
-      </w:r>
-      <w:r>
-        <w:rPr>
-          <w:rFonts w:ascii="Arial" w:hAnsi="Arial" w:cs="Arial"/>
-          <w:lang w:val="pt-PT"/>
-        </w:rPr>
-        <w:t xml:space="preserve">. Neste contexto, as plataformas digitais B2B apresentam-se como uma alternativa relevante para apoiar a gestão de concursos privados e processos de contratação, ao permitir a centralização da informação, a submissão estruturada de propostas, o acompanhamento do processo e a análise comparativa das candidaturas. </w:t>
+        </w:rPr>
+      </w:pPr>
+      <w:r>
+        <w:rPr>
+          <w:rFonts w:ascii="Arial" w:hAnsi="Arial" w:cs="Arial"/>
+          <w:lang w:val="pt-PT"/>
+        </w:rPr>
+        <w:t>É precisamente a partir da identificação destas barreiras sistémicas à eficiência corporativa que surge a pertinência e motivação principal do presente trabalho: o desenvolvimento prático de uma plataforma digital B2B especificamente orientada para o apoio à gestão e contratação de concursos privados dirigidos ao contexto e necessidades das PMEs em Angola</w:t>
+      </w:r>
+      <w:r>
+        <w:rPr>
+          <w:rFonts w:ascii="Arial" w:hAnsi="Arial" w:cs="Arial"/>
+          <w:lang w:val="pt-PT"/>
+        </w:rPr>
+        <w:t xml:space="preserve">. </w:t>
+      </w:r>
+      <w:r>
+        <w:rPr>
+          <w:rFonts w:ascii="Arial" w:hAnsi="Arial" w:cs="Arial"/>
+        </w:rPr>
+        <w:t xml:space="preserve">No contexto das pequenas e médias empresas (PMEs), </w:t>
+      </w:r>
+      <w:r>
+        <w:rPr>
+          <w:rFonts w:ascii="Arial" w:hAnsi="Arial" w:cs="Arial"/>
+        </w:rPr>
+        <w:t xml:space="preserve">a utilização </w:t>
+      </w:r>
+      <w:r>
+        <w:rPr>
+          <w:rFonts w:ascii="Arial" w:hAnsi="Arial" w:cs="Arial"/>
+        </w:rPr>
+        <w:t xml:space="preserve">de plataformas digitais assume um papel estratégico e de sobrevivência. Estas organizações enfrentam frequentemente limitações estruturais, financeiras e informacionais que dificultam o acesso a grandes mercados e a gestão optimizada dos seus processos internos. Em economias em desenvolvimento, como é o caso de Angola, essas vulnerabilidades são acentuadas por um ecossistema de negócios </w:t>
+      </w:r>
+      <w:r>
+        <w:rPr>
+          <w:rFonts w:ascii="Arial" w:hAnsi="Arial" w:cs="Arial"/>
+        </w:rPr>
+        <w:lastRenderedPageBreak/>
+        <w:t>que ainda regista profundas assimetrias de informação, justificando a urgência na adopção de soluções tecnológicas alinhadas à realidade local.</w:t>
       </w:r>
     </w:p>
     <w:p>
@@ -4035,29 +3927,821 @@
         <w:jc w:val="both"/>
         <w:rPr>
           <w:rFonts w:ascii="Arial" w:hAnsi="Arial" w:cs="Arial"/>
-          <w:lang w:val="pt-PT"/>
-        </w:rPr>
-      </w:pPr>
-      <w:r>
-        <w:rPr>
-          <w:rFonts w:ascii="Arial" w:hAnsi="Arial" w:cs="Arial"/>
-          <w:lang w:val="pt-PT"/>
-        </w:rPr>
-        <w:t>Adicionalmente, a incorporação de mecanismos de validação empresarial, notificações automáticas e painéis de controlo pode contribuir para maior transparência, eficiência e apoio à tomada de decisão por parte das PME</w:t>
-      </w:r>
-      <w:r>
-        <w:rPr>
-          <w:rFonts w:ascii="Arial" w:hAnsi="Arial" w:cs="Arial"/>
-          <w:lang w:val="pt-PT"/>
-        </w:rPr>
-        <w:t>s</w:t>
-      </w:r>
-      <w:r>
-        <w:rPr>
-          <w:rFonts w:ascii="Arial" w:hAnsi="Arial" w:cs="Arial"/>
-          <w:lang w:val="pt-PT"/>
-        </w:rPr>
-        <w:t xml:space="preserve"> envolvidas. </w:t>
+        </w:rPr>
+      </w:pPr>
+      <w:r>
+        <w:rPr>
+          <w:rFonts w:ascii="Arial" w:hAnsi="Arial" w:cs="Arial"/>
+        </w:rPr>
+        <w:t>Tanto no sector público quanto no privado, a contratação de fornecedores e parceiros de negócio deveria reger-se por processos competitivos e abertos, garantindo a selecção das propostas mais vantajosas sob critérios técnicos e financeiros. No entanto, a realidade do mercado angolano revela um cenário fortemente marcado pela opacidade e pela elevada incidência de procedimentos de contratação directa, comummente designada por "contratação simplificada".</w:t>
+      </w:r>
+      <w:r>
+        <w:t xml:space="preserve"> </w:t>
+      </w:r>
+      <w:r>
+        <w:rPr>
+          <w:rFonts w:ascii="Arial" w:hAnsi="Arial" w:cs="Arial"/>
+        </w:rPr>
+        <w:t>De acordo com a Lei dos Contratos Públicos (Lei n.º 41/20), a contratação simplificada deve ser um procedimento de excepção, fundamentada em critérios materiais (como urgência imperiosa) ou por limite do valor estimado. Contudo, a prática de mercado demonstra a subversão desta excepção numa regra geral</w:t>
+      </w:r>
+      <w:r>
+        <w:rPr>
+          <w:rFonts w:ascii="Arial" w:hAnsi="Arial" w:cs="Arial"/>
+        </w:rPr>
+        <w:t xml:space="preserve"> (Angola, 2020)</w:t>
+      </w:r>
+      <w:r>
+        <w:rPr>
+          <w:rFonts w:ascii="Arial" w:hAnsi="Arial" w:cs="Arial"/>
+        </w:rPr>
+        <w:t>.</w:t>
+      </w:r>
+      <w:r>
+        <w:rPr>
+          <w:rFonts w:ascii="Arial" w:hAnsi="Arial" w:cs="Arial"/>
+        </w:rPr>
+        <w:t xml:space="preserve"> </w:t>
+      </w:r>
+    </w:p>
+    <w:p>
+      <w:pPr>
+        <w:spacing w:line="360" w:lineRule="auto"/>
+        <w:ind w:firstLine="360"/>
+        <w:jc w:val="both"/>
+        <w:rPr>
+          <w:rFonts w:ascii="Arial" w:hAnsi="Arial" w:cs="Arial"/>
+        </w:rPr>
+      </w:pPr>
+      <w:r>
+        <w:rPr>
+          <w:rFonts w:ascii="Arial" w:hAnsi="Arial" w:cs="Arial"/>
+        </w:rPr>
+        <w:t xml:space="preserve">A título de exemplo, no domínio do Estado, os relatórios, boletins e dashboards estatísticos do Serviço Nacional da Contratação Pública (SNCP) evidenciam, </w:t>
+      </w:r>
+      <w:r>
+        <w:rPr>
+          <w:rFonts w:ascii="Arial" w:hAnsi="Arial" w:cs="Arial"/>
+        </w:rPr>
+        <w:t xml:space="preserve">entre </w:t>
+      </w:r>
+      <w:r>
+        <w:rPr>
+          <w:rFonts w:ascii="Arial" w:hAnsi="Arial" w:cs="Arial"/>
+        </w:rPr>
+        <w:t xml:space="preserve">o ano 2022 </w:t>
+      </w:r>
+      <w:r>
+        <w:rPr>
+          <w:rFonts w:ascii="Arial" w:hAnsi="Arial" w:cs="Arial"/>
+        </w:rPr>
+        <w:t xml:space="preserve">a </w:t>
+      </w:r>
+      <w:r>
+        <w:rPr>
+          <w:rFonts w:ascii="Arial" w:hAnsi="Arial" w:cs="Arial"/>
+        </w:rPr>
+        <w:t>202</w:t>
+      </w:r>
+      <w:r>
+        <w:rPr>
+          <w:rFonts w:ascii="Arial" w:hAnsi="Arial" w:cs="Arial"/>
+        </w:rPr>
+        <w:t>5</w:t>
+      </w:r>
+      <w:r>
+        <w:rPr>
+          <w:rFonts w:ascii="Arial" w:hAnsi="Arial" w:cs="Arial"/>
+        </w:rPr>
+        <w:t xml:space="preserve">, que uma percentagem </w:t>
+      </w:r>
+      <w:r>
+        <w:rPr>
+          <w:rFonts w:ascii="Arial" w:hAnsi="Arial" w:cs="Arial"/>
+        </w:rPr>
+        <w:t>dominadora</w:t>
+      </w:r>
+      <w:r>
+        <w:rPr>
+          <w:rFonts w:ascii="Arial" w:hAnsi="Arial" w:cs="Arial"/>
+        </w:rPr>
+        <w:t xml:space="preserve"> dos procedimentos (e o consequente volume financeiro adjudicado) ocorre por vias não concorrenciais (SNCP, 202</w:t>
+      </w:r>
+      <w:r>
+        <w:rPr>
+          <w:rFonts w:ascii="Arial" w:hAnsi="Arial" w:cs="Arial"/>
+        </w:rPr>
+        <w:t>6</w:t>
+      </w:r>
+      <w:r>
+        <w:rPr>
+          <w:rFonts w:ascii="Arial" w:hAnsi="Arial" w:cs="Arial"/>
+        </w:rPr>
+        <w:t xml:space="preserve">). Os dados oficiais documentam que dos </w:t>
+      </w:r>
+      <w:r>
+        <w:rPr>
+          <w:rFonts w:ascii="Arial" w:hAnsi="Arial" w:cs="Arial"/>
+        </w:rPr>
+        <w:t>87</w:t>
+      </w:r>
+      <w:r>
+        <w:rPr>
+          <w:rFonts w:ascii="Arial" w:hAnsi="Arial" w:cs="Arial"/>
+        </w:rPr>
+        <w:t>87</w:t>
+      </w:r>
+      <w:r>
+        <w:rPr>
+          <w:rFonts w:ascii="Arial" w:hAnsi="Arial" w:cs="Arial"/>
+        </w:rPr>
+        <w:t xml:space="preserve"> procedimentos registados na plataforma, </w:t>
+      </w:r>
+      <w:r>
+        <w:rPr>
+          <w:rFonts w:ascii="Arial" w:hAnsi="Arial" w:cs="Arial"/>
+        </w:rPr>
+        <w:t>aproximadamente 67%</w:t>
+      </w:r>
+      <w:r>
+        <w:rPr>
+          <w:rFonts w:ascii="Arial" w:hAnsi="Arial" w:cs="Arial"/>
+        </w:rPr>
+        <w:t xml:space="preserve"> ocorreram sob a forma de Contratação Simplificada. Em termos de volume financeiro, as contratações directas concentraram </w:t>
+      </w:r>
+      <w:r>
+        <w:rPr>
+          <w:rFonts w:ascii="Arial" w:hAnsi="Arial" w:cs="Arial"/>
+        </w:rPr>
+        <w:t>10</w:t>
+      </w:r>
+      <w:r>
+        <w:rPr>
+          <w:rFonts w:ascii="Arial" w:hAnsi="Arial" w:cs="Arial"/>
+        </w:rPr>
+        <w:t>.</w:t>
+      </w:r>
+      <w:r>
+        <w:rPr>
+          <w:rFonts w:ascii="Arial" w:hAnsi="Arial" w:cs="Arial"/>
+        </w:rPr>
+        <w:t>099</w:t>
+      </w:r>
+      <w:r>
+        <w:rPr>
+          <w:rFonts w:ascii="Arial" w:hAnsi="Arial" w:cs="Arial"/>
+        </w:rPr>
+        <w:t>.</w:t>
+      </w:r>
+      <w:r>
+        <w:rPr>
+          <w:rFonts w:ascii="Arial" w:hAnsi="Arial" w:cs="Arial"/>
+        </w:rPr>
+        <w:t>358</w:t>
+      </w:r>
+      <w:r>
+        <w:rPr>
+          <w:rFonts w:ascii="Arial" w:hAnsi="Arial" w:cs="Arial"/>
+        </w:rPr>
+        <w:t>.</w:t>
+      </w:r>
+      <w:r>
+        <w:rPr>
+          <w:rFonts w:ascii="Arial" w:hAnsi="Arial" w:cs="Arial"/>
+        </w:rPr>
+        <w:t>727</w:t>
+      </w:r>
+      <w:r>
+        <w:rPr>
+          <w:rFonts w:ascii="Arial" w:hAnsi="Arial" w:cs="Arial"/>
+        </w:rPr>
+        <w:t>.</w:t>
+      </w:r>
+      <w:r>
+        <w:rPr>
+          <w:rFonts w:ascii="Arial" w:hAnsi="Arial" w:cs="Arial"/>
+        </w:rPr>
+        <w:t>856</w:t>
+      </w:r>
+      <w:r>
+        <w:rPr>
+          <w:rFonts w:ascii="Arial" w:hAnsi="Arial" w:cs="Arial"/>
+        </w:rPr>
+        <w:t>,</w:t>
+      </w:r>
+      <w:r>
+        <w:rPr>
+          <w:rFonts w:ascii="Arial" w:hAnsi="Arial" w:cs="Arial"/>
+        </w:rPr>
+        <w:t>37</w:t>
+      </w:r>
+      <w:r>
+        <w:rPr>
+          <w:rFonts w:ascii="Arial" w:hAnsi="Arial" w:cs="Arial"/>
+        </w:rPr>
+        <w:t>(AOA)</w:t>
+      </w:r>
+      <w:r>
+        <w:rPr>
+          <w:rFonts w:ascii="Arial" w:hAnsi="Arial" w:cs="Arial"/>
+        </w:rPr>
+        <w:t xml:space="preserve"> dos fundos, sendo as tipologias de objecto mais frequentes a </w:t>
+      </w:r>
+      <w:r>
+        <w:rPr>
+          <w:rFonts w:ascii="Arial" w:hAnsi="Arial" w:cs="Arial"/>
+        </w:rPr>
+        <w:t>Empreitada de obras públicas</w:t>
+      </w:r>
+      <w:r>
+        <w:rPr>
+          <w:rFonts w:ascii="Arial" w:hAnsi="Arial" w:cs="Arial"/>
+        </w:rPr>
+        <w:t xml:space="preserve"> (</w:t>
+      </w:r>
+      <w:r>
+        <w:rPr>
+          <w:rFonts w:ascii="Arial" w:hAnsi="Arial" w:cs="Arial"/>
+        </w:rPr>
+        <w:t>74,3</w:t>
+      </w:r>
+      <w:r>
+        <w:rPr>
+          <w:rFonts w:ascii="Arial" w:hAnsi="Arial" w:cs="Arial"/>
+        </w:rPr>
+        <w:t xml:space="preserve">%) e a </w:t>
+      </w:r>
+      <w:r>
+        <w:rPr>
+          <w:rFonts w:ascii="Arial" w:hAnsi="Arial" w:cs="Arial"/>
+        </w:rPr>
+        <w:t>Aquisição de serviços</w:t>
+      </w:r>
+      <w:r>
+        <w:rPr>
+          <w:rFonts w:ascii="Arial" w:hAnsi="Arial" w:cs="Arial"/>
+        </w:rPr>
+        <w:t xml:space="preserve"> (</w:t>
+      </w:r>
+      <w:r>
+        <w:rPr>
+          <w:rFonts w:ascii="Arial" w:hAnsi="Arial" w:cs="Arial"/>
+        </w:rPr>
+        <w:t>15,7</w:t>
+      </w:r>
+      <w:r>
+        <w:rPr>
+          <w:rFonts w:ascii="Arial" w:hAnsi="Arial" w:cs="Arial"/>
+        </w:rPr>
+        <w:t>%), limitando a livre concorrência a uma margem residual.</w:t>
+      </w:r>
+    </w:p>
+    <w:tbl>
+      <w:tblPr>
+        <w:tblStyle w:val="TabeladeLista4"/>
+        <w:tblW w:w="7928" w:type="dxa"/>
+        <w:tblLook w:val="0620" w:firstRow="1" w:lastRow="0" w:firstColumn="0" w:lastColumn="0" w:noHBand="1" w:noVBand="1"/>
+      </w:tblPr>
+      <w:tblGrid>
+        <w:gridCol w:w="4810"/>
+        <w:gridCol w:w="3118"/>
+      </w:tblGrid>
+      <w:tr>
+        <w:trPr>
+          <w:cnfStyle w:val="100000000000" w:firstRow="1" w:lastRow="0" w:firstColumn="0" w:lastColumn="0" w:oddVBand="0" w:evenVBand="0" w:oddHBand="0" w:evenHBand="0" w:firstRowFirstColumn="0" w:firstRowLastColumn="0" w:lastRowFirstColumn="0" w:lastRowLastColumn="0"/>
+        </w:trPr>
+        <w:tc>
+          <w:tcPr>
+            <w:tcW w:w="4810" w:type="dxa"/>
+          </w:tcPr>
+          <w:p>
+            <w:r>
+              <w:rPr>
+                <w:lang w:val="pt-PT"/>
+              </w:rPr>
+              <w:t>PROCEDIMENTOS</w:t>
+            </w:r>
+          </w:p>
+        </w:tc>
+        <w:tc>
+          <w:tcPr>
+            <w:tcW w:w="3118" w:type="dxa"/>
+          </w:tcPr>
+          <w:p>
+            <w:pPr>
+              <w:jc w:val="center"/>
+            </w:pPr>
+            <w:r>
+              <w:t>TOTAL DE PCPs</w:t>
+            </w:r>
+          </w:p>
+        </w:tc>
+      </w:tr>
+      <w:tr>
+        <w:tc>
+          <w:tcPr>
+            <w:tcW w:w="4810" w:type="dxa"/>
+          </w:tcPr>
+          <w:p>
+            <w:r>
+              <w:rPr>
+                <w:lang w:val="pt-PT"/>
+              </w:rPr>
+              <w:t>Contratação simplificada</w:t>
+            </w:r>
+          </w:p>
+        </w:tc>
+        <w:tc>
+          <w:tcPr>
+            <w:tcW w:w="3118" w:type="dxa"/>
+          </w:tcPr>
+          <w:p>
+            <w:pPr>
+              <w:jc w:val="center"/>
+            </w:pPr>
+            <w:r>
+              <w:t>5884</w:t>
+            </w:r>
+          </w:p>
+        </w:tc>
+      </w:tr>
+      <w:tr>
+        <w:tc>
+          <w:tcPr>
+            <w:tcW w:w="4810" w:type="dxa"/>
+          </w:tcPr>
+          <w:p>
+            <w:r>
+              <w:t>Concurso Limitado por Convite</w:t>
+            </w:r>
+          </w:p>
+        </w:tc>
+        <w:tc>
+          <w:tcPr>
+            <w:tcW w:w="3118" w:type="dxa"/>
+          </w:tcPr>
+          <w:p>
+            <w:pPr>
+              <w:jc w:val="center"/>
+            </w:pPr>
+            <w:r>
+              <w:t>1512</w:t>
+            </w:r>
+          </w:p>
+        </w:tc>
+      </w:tr>
+      <w:tr>
+        <w:tc>
+          <w:tcPr>
+            <w:tcW w:w="4810" w:type="dxa"/>
+          </w:tcPr>
+          <w:p>
+            <w:r>
+              <w:rPr>
+                <w:lang w:val="pt-PT"/>
+              </w:rPr>
+              <w:t>Concurso Público</w:t>
+            </w:r>
+          </w:p>
+        </w:tc>
+        <w:tc>
+          <w:tcPr>
+            <w:tcW w:w="3118" w:type="dxa"/>
+          </w:tcPr>
+          <w:p>
+            <w:pPr>
+              <w:jc w:val="center"/>
+            </w:pPr>
+            <w:r>
+              <w:rPr>
+                <w:lang w:val="pt-PT"/>
+              </w:rPr>
+              <w:t>679</w:t>
+            </w:r>
+          </w:p>
+        </w:tc>
+      </w:tr>
+      <w:tr>
+        <w:tc>
+          <w:tcPr>
+            <w:tcW w:w="4810" w:type="dxa"/>
+          </w:tcPr>
+          <w:p>
+            <w:r>
+              <w:rPr>
+                <w:lang w:val="pt-PT"/>
+              </w:rPr>
+              <w:t>Contratação Emergencial</w:t>
+            </w:r>
+          </w:p>
+        </w:tc>
+        <w:tc>
+          <w:tcPr>
+            <w:tcW w:w="3118" w:type="dxa"/>
+          </w:tcPr>
+          <w:p>
+            <w:pPr>
+              <w:jc w:val="center"/>
+            </w:pPr>
+            <w:r>
+              <w:rPr>
+                <w:lang w:val="pt-PT"/>
+              </w:rPr>
+              <w:t>351</w:t>
+            </w:r>
+          </w:p>
+        </w:tc>
+      </w:tr>
+      <w:tr>
+        <w:tc>
+          <w:tcPr>
+            <w:tcW w:w="4810" w:type="dxa"/>
+          </w:tcPr>
+          <w:p>
+            <w:r>
+              <w:rPr>
+                <w:lang w:val="pt-PT"/>
+              </w:rPr>
+              <w:t>Procedimento Dinâmico Electrónico</w:t>
+            </w:r>
+          </w:p>
+        </w:tc>
+        <w:tc>
+          <w:tcPr>
+            <w:tcW w:w="3118" w:type="dxa"/>
+          </w:tcPr>
+          <w:p>
+            <w:pPr>
+              <w:jc w:val="center"/>
+            </w:pPr>
+            <w:r>
+              <w:t>250</w:t>
+            </w:r>
+          </w:p>
+        </w:tc>
+      </w:tr>
+      <w:tr>
+        <w:tc>
+          <w:tcPr>
+            <w:tcW w:w="4810" w:type="dxa"/>
+          </w:tcPr>
+          <w:p>
+            <w:r>
+              <w:t>Concurso Limitado por Prévia Qualificação</w:t>
+            </w:r>
+          </w:p>
+        </w:tc>
+        <w:tc>
+          <w:tcPr>
+            <w:tcW w:w="3118" w:type="dxa"/>
+          </w:tcPr>
+          <w:p>
+            <w:pPr>
+              <w:jc w:val="center"/>
+            </w:pPr>
+            <w:r>
+              <w:t>111</w:t>
+            </w:r>
+          </w:p>
+        </w:tc>
+      </w:tr>
+      <w:tr>
+        <w:tc>
+          <w:tcPr>
+            <w:tcW w:w="4810" w:type="dxa"/>
+          </w:tcPr>
+          <w:p>
+            <w:pPr>
+              <w:rPr>
+                <w:b/>
+                <w:bCs/>
+              </w:rPr>
+            </w:pPr>
+            <w:r>
+              <w:rPr>
+                <w:b/>
+                <w:bCs/>
+                <w:lang w:val="pt-PT"/>
+              </w:rPr>
+              <w:t>Total</w:t>
+            </w:r>
+          </w:p>
+        </w:tc>
+        <w:tc>
+          <w:tcPr>
+            <w:tcW w:w="3118" w:type="dxa"/>
+          </w:tcPr>
+          <w:p>
+            <w:pPr>
+              <w:jc w:val="center"/>
+              <w:rPr>
+                <w:b/>
+                <w:bCs/>
+              </w:rPr>
+            </w:pPr>
+            <w:r>
+              <w:rPr>
+                <w:b/>
+                <w:bCs/>
+                <w:lang w:val="pt-PT"/>
+              </w:rPr>
+              <w:t>8787</w:t>
+            </w:r>
+          </w:p>
+        </w:tc>
+      </w:tr>
+    </w:tbl>
+    <w:p>
+      <w:pPr>
+        <w:spacing w:line="360" w:lineRule="auto"/>
+        <w:jc w:val="both"/>
+        <w:rPr>
+          <w:rFonts w:ascii="Arial" w:hAnsi="Arial" w:cs="Arial"/>
+        </w:rPr>
+      </w:pPr>
+      <w:r>
+        <w:rPr>
+          <w:noProof/>
+        </w:rPr>
+        <mc:AlternateContent>
+          <mc:Choice Requires="wps">
+            <w:drawing>
+              <wp:anchor distT="0" distB="0" distL="114300" distR="114300" simplePos="0" relativeHeight="251668480" behindDoc="0" locked="0" layoutInCell="1" allowOverlap="1" wp14:anchorId="2B486370" wp14:editId="1470799D">
+                <wp:simplePos x="0" y="0"/>
+                <wp:positionH relativeFrom="column">
+                  <wp:posOffset>-205345</wp:posOffset>
+                </wp:positionH>
+                <wp:positionV relativeFrom="paragraph">
+                  <wp:posOffset>-395</wp:posOffset>
+                </wp:positionV>
+                <wp:extent cx="5344160" cy="635"/>
+                <wp:effectExtent l="0" t="0" r="0" b="0"/>
+                <wp:wrapSquare wrapText="bothSides"/>
+                <wp:docPr id="489969762" name="Caixa de texto 1"/>
+                <wp:cNvGraphicFramePr/>
+                <a:graphic xmlns:a="http://schemas.openxmlformats.org/drawingml/2006/main">
+                  <a:graphicData uri="http://schemas.microsoft.com/office/word/2010/wordprocessingShape">
+                    <wps:wsp>
+                      <wps:cNvSpPr txBox="1"/>
+                      <wps:spPr>
+                        <a:xfrm>
+                          <a:off x="0" y="0"/>
+                          <a:ext cx="5344160" cy="635"/>
+                        </a:xfrm>
+                        <a:prstGeom prst="rect">
+                          <a:avLst/>
+                        </a:prstGeom>
+                        <a:solidFill>
+                          <a:prstClr val="white"/>
+                        </a:solidFill>
+                        <a:ln>
+                          <a:noFill/>
+                        </a:ln>
+                      </wps:spPr>
+                      <wps:txbx>
+                        <w:txbxContent>
+                          <w:p>
+                            <w:pPr>
+                              <w:pStyle w:val="Legenda"/>
+                              <w:jc w:val="center"/>
+                              <w:rPr>
+                                <w:rFonts w:ascii="Arial" w:hAnsi="Arial" w:cs="Arial"/>
+                              </w:rPr>
+                            </w:pPr>
+                            <w:r>
+                              <w:t xml:space="preserve">Tabela </w:t>
+                            </w:r>
+                            <w:r>
+                              <w:fldChar w:fldCharType="begin"/>
+                            </w:r>
+                            <w:r>
+                              <w:instrText xml:space="preserve"> SEQ Figura \* ARABIC </w:instrText>
+                            </w:r>
+                            <w:r>
+                              <w:fldChar w:fldCharType="separate"/>
+                            </w:r>
+                            <w:r>
+                              <w:rPr>
+                                <w:noProof/>
+                              </w:rPr>
+                              <w:t>1</w:t>
+                            </w:r>
+                            <w:r>
+                              <w:rPr>
+                                <w:noProof/>
+                              </w:rPr>
+                              <w:fldChar w:fldCharType="end"/>
+                            </w:r>
+                            <w:r>
+                              <w:t xml:space="preserve"> – </w:t>
+                            </w:r>
+                            <w:r>
+                              <w:t>Nº</w:t>
+                            </w:r>
+                            <w:r>
+                              <w:t xml:space="preserve"> de PCPs </w:t>
+                            </w:r>
+                            <w:r>
+                              <w:t xml:space="preserve">por tipo de procedimento </w:t>
+                            </w:r>
+                            <w:r>
+                              <w:t>registados 2022-202</w:t>
+                            </w:r>
+                            <w:r>
+                              <w:t>5</w:t>
+                            </w:r>
+                            <w:r>
+                              <w:br/>
+                              <w:t>Fonte:</w:t>
+                            </w:r>
+                            <w:r>
+                              <w:t xml:space="preserve"> Adaptado</w:t>
+                            </w:r>
+                            <w:r>
+                              <w:t xml:space="preserve"> SNCP</w:t>
+                            </w:r>
+                            <w:r>
+                              <w:t xml:space="preserve"> (2026)</w:t>
+                            </w:r>
+                          </w:p>
+                        </w:txbxContent>
+                      </wps:txbx>
+                      <wps:bodyPr rot="0" spcFirstLastPara="0" vertOverflow="overflow" horzOverflow="overflow" vert="horz" wrap="square" lIns="0" tIns="0" rIns="0" bIns="0" numCol="1" spcCol="0" rtlCol="0" fromWordArt="0" anchor="t" anchorCtr="0" forceAA="0" compatLnSpc="1">
+                        <a:prstTxWarp prst="textNoShape">
+                          <a:avLst/>
+                        </a:prstTxWarp>
+                        <a:spAutoFit/>
+                      </wps:bodyPr>
+                    </wps:wsp>
+                  </a:graphicData>
+                </a:graphic>
+              </wp:anchor>
+            </w:drawing>
+          </mc:Choice>
+          <mc:Fallback>
+            <w:pict>
+              <v:shapetype w14:anchorId="2B486370" id="_x0000_t202" coordsize="21600,21600" o:spt="202" path="m,l,21600r21600,l21600,xe">
+                <v:stroke joinstyle="miter"/>
+                <v:path gradientshapeok="t" o:connecttype="rect"/>
+              </v:shapetype>
+              <v:shape id="Caixa de texto 1" o:spid="_x0000_s1026" type="#_x0000_t202" style="position:absolute;left:0;text-align:left;margin-left:-16.15pt;margin-top:-.05pt;width:420.8pt;height:.05pt;z-index:251668480;visibility:visible;mso-wrap-style:square;mso-wrap-distance-left:9pt;mso-wrap-distance-top:0;mso-wrap-distance-right:9pt;mso-wrap-distance-bottom:0;mso-position-horizontal:absolute;mso-position-horizontal-relative:text;mso-position-vertical:absolute;mso-position-vertical-relative:text;v-text-anchor:top" o:gfxdata="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" stroked="f">
+                <v:textbox style="mso-fit-shape-to-text:t" inset="0,0,0,0">
+                  <w:txbxContent>
+                    <w:p>
+                      <w:pPr>
+                        <w:pStyle w:val="Legenda"/>
+                        <w:jc w:val="center"/>
+                        <w:rPr>
+                          <w:rFonts w:ascii="Arial" w:hAnsi="Arial" w:cs="Arial"/>
+                        </w:rPr>
+                      </w:pPr>
+                      <w:r>
+                        <w:t xml:space="preserve">Tabela </w:t>
+                      </w:r>
+                      <w:r>
+                        <w:fldChar w:fldCharType="begin"/>
+                      </w:r>
+                      <w:r>
+                        <w:instrText xml:space="preserve"> SEQ Figura \* ARABIC </w:instrText>
+                      </w:r>
+                      <w:r>
+                        <w:fldChar w:fldCharType="separate"/>
+                      </w:r>
+                      <w:r>
+                        <w:rPr>
+                          <w:noProof/>
+                        </w:rPr>
+                        <w:t>1</w:t>
+                      </w:r>
+                      <w:r>
+                        <w:rPr>
+                          <w:noProof/>
+                        </w:rPr>
+                        <w:fldChar w:fldCharType="end"/>
+                      </w:r>
+                      <w:r>
+                        <w:t xml:space="preserve"> – </w:t>
+                      </w:r>
+                      <w:r>
+                        <w:t>Nº</w:t>
+                      </w:r>
+                      <w:r>
+                        <w:t xml:space="preserve"> de PCPs </w:t>
+                      </w:r>
+                      <w:r>
+                        <w:t xml:space="preserve">por tipo de procedimento </w:t>
+                      </w:r>
+                      <w:r>
+                        <w:t>registados 2022-202</w:t>
+                      </w:r>
+                      <w:r>
+                        <w:t>5</w:t>
+                      </w:r>
+                      <w:r>
+                        <w:br/>
+                        <w:t>Fonte:</w:t>
+                      </w:r>
+                      <w:r>
+                        <w:t xml:space="preserve"> Adaptado</w:t>
+                      </w:r>
+                      <w:r>
+                        <w:t xml:space="preserve"> SNCP</w:t>
+                      </w:r>
+                      <w:r>
+                        <w:t xml:space="preserve"> (2026)</w:t>
+                      </w:r>
+                    </w:p>
+                  </w:txbxContent>
+                </v:textbox>
+                <w10:wrap type="square"/>
+              </v:shape>
+            </w:pict>
+          </mc:Fallback>
+        </mc:AlternateContent>
+      </w:r>
+    </w:p>
+    <w:p>
+      <w:pPr>
+        <w:spacing w:line="360" w:lineRule="auto"/>
+        <w:ind w:firstLine="360"/>
+        <w:jc w:val="both"/>
+        <w:rPr>
+          <w:rFonts w:ascii="Arial" w:hAnsi="Arial" w:cs="Arial"/>
+        </w:rPr>
+      </w:pPr>
+      <w:r>
+        <w:rPr>
+          <w:rFonts w:ascii="Arial" w:hAnsi="Arial" w:cs="Arial"/>
+        </w:rPr>
+        <w:lastRenderedPageBreak/>
+        <w:t xml:space="preserve">Embora estas estatísticas oficiais centralizadas pelo Portal das Compras Públicas retratem o panorama do Estado, a dinâmica do sector B2B (Business-to-Business) privado em Angola opera sob lógicas muito semelhantes e com uma agravante: a ausência total de escrutínio. Sem a obrigatoriedade de lançamento de concursos públicos, grande parte do tecido empresarial privado recorre a indicações informais, relações </w:t>
+      </w:r>
+      <w:r>
+        <w:rPr>
+          <w:rFonts w:ascii="Arial" w:hAnsi="Arial" w:cs="Arial"/>
+        </w:rPr>
+        <w:t xml:space="preserve">de confiança </w:t>
+      </w:r>
+      <w:r>
+        <w:rPr>
+          <w:rFonts w:ascii="Arial" w:hAnsi="Arial" w:cs="Arial"/>
+        </w:rPr>
+        <w:t>e um networking altamente restrito para selecionar fornecedores. Esta falta de transparência e o uso massivo da adjudicação directa criam barreiras severas à entrada de novas PMEs no mercado. Consequentemente, muitas empresas fornecedoras que dispõem de propostas financeiras e técnicas vantajosas não chegam sequer a tomar conhecimento das necessidades de aquisição das médias e grandes organizações, perdendo potenciais oportunidades de expansão.</w:t>
+      </w:r>
+    </w:p>
+    <w:p>
+      <w:pPr>
+        <w:spacing w:line="360" w:lineRule="auto"/>
+        <w:ind w:firstLine="360"/>
+        <w:jc w:val="both"/>
+        <w:rPr>
+          <w:rFonts w:ascii="Arial" w:hAnsi="Arial" w:cs="Arial"/>
+        </w:rPr>
+      </w:pPr>
+      <w:r>
+        <w:rPr>
+          <w:rFonts w:ascii="Arial" w:hAnsi="Arial" w:cs="Arial"/>
+        </w:rPr>
+        <w:t xml:space="preserve">A nível internacional, o cenário </w:t>
+      </w:r>
+      <w:r>
+        <w:rPr>
+          <w:rFonts w:ascii="Arial" w:hAnsi="Arial" w:cs="Arial"/>
+        </w:rPr>
+        <w:t>diferencia-se</w:t>
+      </w:r>
+      <w:r>
+        <w:rPr>
+          <w:rFonts w:ascii="Arial" w:hAnsi="Arial" w:cs="Arial"/>
+        </w:rPr>
+        <w:t xml:space="preserve"> fortemente </w:t>
+      </w:r>
+      <w:r>
+        <w:rPr>
+          <w:rFonts w:ascii="Arial" w:hAnsi="Arial" w:cs="Arial"/>
+        </w:rPr>
+        <w:t>do</w:t>
+      </w:r>
+      <w:r>
+        <w:rPr>
+          <w:rFonts w:ascii="Arial" w:hAnsi="Arial" w:cs="Arial"/>
+        </w:rPr>
+        <w:t xml:space="preserve"> mercado angolano. Relatórios de instituições como a Organização para a Cooperação e Desenvolvimento Económico indicam que a adopção massiva e a migração para plataformas de contratação digital (e-procurement) em ambientes concorrenciais aumentam significativamente a transparência, estimando-se que fomentem uma redução de custos de aquisição na ordem dos 10% a 20%, mitigando em simultâneo os riscos de favorecimento inter-empresarial e distorções de mercado (OCDE, 2023).</w:t>
+      </w:r>
+    </w:p>
+    <w:p>
+      <w:pPr>
+        <w:spacing w:line="360" w:lineRule="auto"/>
+        <w:ind w:firstLine="360"/>
+        <w:jc w:val="both"/>
+        <w:rPr>
+          <w:rFonts w:ascii="Arial" w:hAnsi="Arial" w:cs="Arial"/>
+        </w:rPr>
+      </w:pPr>
+      <w:r>
+        <w:rPr>
+          <w:rFonts w:ascii="Arial" w:hAnsi="Arial" w:cs="Arial"/>
+        </w:rPr>
+        <w:t>Neste contexto, as plataformas digitais B2B apresentam-se como uma alternativa tecnológica fundamental para mitigar estas falhas de mercado e apoiar a gestão estruturada de concursos privados e processos de contratação. A migração de métodos manuais e herméticos para um ambiente digital partilhado permite não só a democratização no acesso à informação e a divulgação massificada de oportunidades de negócio, mas também assegura a submissão formal de propostas, o acompanhamento do processo em tempo real e a análise comparativa de candidaturas. Adicionalmente, a incorporação de notificações automatizadas e painéis de controlo (dashboards) deverá dotar as PMEs de elevados níveis de transparência e eficiência, promovendo um ambiente de negócios no qual a competitividade assenta efetivamente no mérito comercial de cada organização.</w:t>
       </w:r>
     </w:p>
     <w:p>
@@ -4108,15 +4792,7 @@
           <w:rFonts w:ascii="Arial" w:hAnsi="Arial" w:cs="Arial"/>
           <w:lang w:val="pt-PT"/>
         </w:rPr>
-        <w:t xml:space="preserve">O </w:t>
-      </w:r>
-      <w:proofErr w:type="spellStart"/>
-      <w:r>
-        <w:rPr>
-          <w:rFonts w:ascii="Arial" w:hAnsi="Arial" w:cs="Arial"/>
-          <w:lang w:val="pt-PT"/>
-        </w:rPr>
-        <w:t>obje</w:t>
+        <w:t>O obje</w:t>
       </w:r>
       <w:r>
         <w:rPr>
@@ -4130,15 +4806,7 @@
           <w:rFonts w:ascii="Arial" w:hAnsi="Arial" w:cs="Arial"/>
           <w:lang w:val="pt-PT"/>
         </w:rPr>
-        <w:t>to</w:t>
-      </w:r>
-      <w:proofErr w:type="spellEnd"/>
-      <w:r>
-        <w:rPr>
-          <w:rFonts w:ascii="Arial" w:hAnsi="Arial" w:cs="Arial"/>
-          <w:lang w:val="pt-PT"/>
-        </w:rPr>
-        <w:t xml:space="preserve"> de estudo deste trabalho consiste no desenvolvimento de uma plataforma digital B2B de apoio à gestão de concursos privados e processos de contratação entre pequenas e médias empresas em Angola, com foco na organização, divulgação e acompanhamento de oportunidades, bem como na gestão e análise das propostas submetidas pelas empresas candidatas. </w:t>
+        <w:t xml:space="preserve">to de estudo deste trabalho consiste no desenvolvimento de uma plataforma digital B2B de apoio à gestão de concursos privados e processos de contratação entre pequenas e médias empresas em Angola, com foco na organização, divulgação e acompanhamento de oportunidades, bem como na gestão e análise das propostas submetidas pelas empresas candidatas. </w:t>
       </w:r>
     </w:p>
     <w:p>
@@ -4219,15 +4887,7 @@
           <w:rFonts w:ascii="Arial" w:hAnsi="Arial" w:cs="Arial"/>
           <w:lang w:val="pt-PT"/>
         </w:rPr>
-        <w:t xml:space="preserve">O estudo delimita-se à análise e </w:t>
-      </w:r>
-      <w:proofErr w:type="spellStart"/>
-      <w:r>
-        <w:rPr>
-          <w:rFonts w:ascii="Arial" w:hAnsi="Arial" w:cs="Arial"/>
-          <w:lang w:val="pt-PT"/>
-        </w:rPr>
-        <w:t>conce</w:t>
+        <w:t>O estudo delimita-se à análise e conce</w:t>
       </w:r>
       <w:r>
         <w:rPr>
@@ -4241,15 +4901,7 @@
           <w:rFonts w:ascii="Arial" w:hAnsi="Arial" w:cs="Arial"/>
           <w:lang w:val="pt-PT"/>
         </w:rPr>
-        <w:t>ção</w:t>
-      </w:r>
-      <w:proofErr w:type="spellEnd"/>
-      <w:r>
-        <w:rPr>
-          <w:rFonts w:ascii="Arial" w:hAnsi="Arial" w:cs="Arial"/>
-          <w:lang w:val="pt-PT"/>
-        </w:rPr>
-        <w:t xml:space="preserve"> de uma solução tecnológica orientada às PME</w:t>
+        <w:t>ção de uma solução tecnológica orientada às PME</w:t>
       </w:r>
       <w:r>
         <w:rPr>
@@ -4263,15 +4915,7 @@
           <w:rFonts w:ascii="Arial" w:hAnsi="Arial" w:cs="Arial"/>
           <w:lang w:val="pt-PT"/>
         </w:rPr>
-        <w:t xml:space="preserve">, não abrangendo os procedimentos legais de contratação pública nem os </w:t>
-      </w:r>
-      <w:proofErr w:type="spellStart"/>
-      <w:r>
-        <w:rPr>
-          <w:rFonts w:ascii="Arial" w:hAnsi="Arial" w:cs="Arial"/>
-          <w:lang w:val="pt-PT"/>
-        </w:rPr>
-        <w:t>aspe</w:t>
+        <w:t>, não abrangendo os procedimentos legais de contratação pública nem os aspe</w:t>
       </w:r>
       <w:r>
         <w:rPr>
@@ -4285,15 +4929,7 @@
           <w:rFonts w:ascii="Arial" w:hAnsi="Arial" w:cs="Arial"/>
           <w:lang w:val="pt-PT"/>
         </w:rPr>
-        <w:t>tos</w:t>
-      </w:r>
-      <w:proofErr w:type="spellEnd"/>
-      <w:r>
-        <w:rPr>
-          <w:rFonts w:ascii="Arial" w:hAnsi="Arial" w:cs="Arial"/>
-          <w:lang w:val="pt-PT"/>
-        </w:rPr>
-        <w:t xml:space="preserve"> jurídicos específicos dos contratos. </w:t>
+        <w:t xml:space="preserve">tos jurídicos específicos dos contratos. </w:t>
       </w:r>
     </w:p>
     <w:p>
@@ -4387,15 +5023,7 @@
           <w:rFonts w:ascii="Arial" w:hAnsi="Arial" w:cs="Arial"/>
           <w:lang w:val="pt-PT"/>
         </w:rPr>
-        <w:t xml:space="preserve"> Apesar da relevância dos concursos privados como mecanismo de </w:t>
-      </w:r>
-      <w:proofErr w:type="spellStart"/>
-      <w:r>
-        <w:rPr>
-          <w:rFonts w:ascii="Arial" w:hAnsi="Arial" w:cs="Arial"/>
-          <w:lang w:val="pt-PT"/>
-        </w:rPr>
-        <w:t>sele</w:t>
+        <w:t xml:space="preserve"> Apesar da relevância dos concursos privados como mecanismo de sele</w:t>
       </w:r>
       <w:r>
         <w:rPr>
@@ -4409,15 +5037,7 @@
           <w:rFonts w:ascii="Arial" w:hAnsi="Arial" w:cs="Arial"/>
           <w:lang w:val="pt-PT"/>
         </w:rPr>
-        <w:t>ção</w:t>
-      </w:r>
-      <w:proofErr w:type="spellEnd"/>
-      <w:r>
-        <w:rPr>
-          <w:rFonts w:ascii="Arial" w:hAnsi="Arial" w:cs="Arial"/>
-          <w:lang w:val="pt-PT"/>
-        </w:rPr>
-        <w:t xml:space="preserve"> de fornecedores e prestadores de serviços no se</w:t>
+        <w:t>ção de fornecedores e prestadores de serviços no se</w:t>
       </w:r>
       <w:r>
         <w:rPr>
@@ -4826,26 +5446,6 @@
     </w:p>
     <w:p>
       <w:pPr>
-        <w:spacing w:line="360" w:lineRule="auto"/>
-        <w:rPr>
-          <w:rFonts w:ascii="Arial" w:hAnsi="Arial" w:cs="Arial"/>
-          <w:b/>
-          <w:bCs/>
-        </w:rPr>
-      </w:pPr>
-    </w:p>
-    <w:p>
-      <w:pPr>
-        <w:spacing w:line="360" w:lineRule="auto"/>
-        <w:rPr>
-          <w:rFonts w:ascii="Arial" w:hAnsi="Arial" w:cs="Arial"/>
-          <w:b/>
-          <w:bCs/>
-        </w:rPr>
-      </w:pPr>
-    </w:p>
-    <w:p>
-      <w:pPr>
         <w:pStyle w:val="Ttulo1"/>
         <w:numPr>
           <w:ilvl w:val="0"/>
@@ -4871,6 +5471,7 @@
           <w:sz w:val="24"/>
           <w:szCs w:val="24"/>
         </w:rPr>
+        <w:lastRenderedPageBreak/>
         <w:t>JUSTIFICA</w:t>
       </w:r>
       <w:r>
@@ -5004,6 +5605,7 @@
         </w:rPr>
         <w:t xml:space="preserve">. </w:t>
       </w:r>
+      <w:bookmarkEnd w:id="9"/>
       <w:r>
         <w:rPr>
           <w:rFonts w:ascii="Arial" w:hAnsi="Arial" w:cs="Arial"/>
@@ -5013,9 +5615,8 @@
           <w:sz w:val="24"/>
           <w:szCs w:val="24"/>
         </w:rPr>
-        <w:t>MARCOS DE REFERÊNCIA</w:t>
-      </w:r>
-      <w:bookmarkEnd w:id="9"/>
+        <w:t>FUNDAMENTAÇÃO TEÓRICA</w:t>
+      </w:r>
     </w:p>
     <w:p>
       <w:pPr>
@@ -5163,7 +5764,7 @@
         <w:rPr>
           <w:rFonts w:ascii="Arial" w:hAnsi="Arial" w:cs="Arial"/>
         </w:rPr>
-        <w:t xml:space="preserve"> PMEs em Angola, são classificadas legalmente de acordo com a Lei n.º 30/11, de 13 de setembro (Assembleia Nacional de Angola, 2011) com base no </w:t>
+        <w:t xml:space="preserve"> PMEs em Angola, são classificadas legalmente de acordo com a Lei n.º 30/11, de 13 de setembro (Angola, 2011) com base no </w:t>
       </w:r>
       <w:r>
         <w:rPr>
@@ -5298,9 +5899,12 @@
         <w:rPr>
           <w:noProof/>
         </w:rPr>
-        <w:t>1</w:t>
-      </w:r>
-      <w:r>
+        <w:t>2</w:t>
+      </w:r>
+      <w:r>
+        <w:rPr>
+          <w:noProof/>
+        </w:rPr>
         <w:fldChar w:fldCharType="end"/>
       </w:r>
       <w:r>
@@ -5320,7 +5924,16 @@
         <w:t>F</w:t>
       </w:r>
       <w:r>
-        <w:t>onte: Autor</w:t>
+        <w:t xml:space="preserve">onte: </w:t>
+      </w:r>
+      <w:r>
+        <w:t xml:space="preserve">Adaptado </w:t>
+      </w:r>
+      <w:r>
+        <w:t>INAPEM</w:t>
+      </w:r>
+      <w:r>
+        <w:t xml:space="preserve"> (2026)</w:t>
       </w:r>
     </w:p>
     <w:p>
@@ -6130,6 +6743,15 @@
     </w:p>
     <w:p>
       <w:pPr>
+        <w:spacing w:line="360" w:lineRule="auto"/>
+        <w:jc w:val="both"/>
+        <w:rPr>
+          <w:rFonts w:ascii="Arial" w:hAnsi="Arial" w:cs="Arial"/>
+        </w:rPr>
+      </w:pPr>
+    </w:p>
+    <w:p>
+      <w:pPr>
         <w:pStyle w:val="Ttulo2"/>
         <w:spacing w:line="360" w:lineRule="auto"/>
         <w:jc w:val="both"/>
@@ -6152,7 +6774,7 @@
           <w:sz w:val="24"/>
           <w:szCs w:val="24"/>
         </w:rPr>
-        <w:t>4</w:t>
+        <w:t>5</w:t>
       </w:r>
       <w:r>
         <w:rPr>
@@ -6163,144 +6785,10 @@
           <w:sz w:val="24"/>
           <w:szCs w:val="24"/>
         </w:rPr>
-        <w:t>.4 ANTECEDENTES DO PROBLEMA: O QUE EXISTE SOBRE O OBJECTO DE INVESTIGAÇÃO</w:t>
+        <w:t xml:space="preserve"> </w:t>
       </w:r>
       <w:bookmarkEnd w:id="17"/>
-    </w:p>
-    <w:p>
-      <w:pPr>
-        <w:spacing w:line="360" w:lineRule="auto"/>
-        <w:ind w:firstLine="720"/>
-        <w:jc w:val="both"/>
-        <w:rPr>
-          <w:rFonts w:ascii="Arial" w:hAnsi="Arial" w:cs="Arial"/>
-        </w:rPr>
-      </w:pPr>
-      <w:r>
-        <w:rPr>
-          <w:rFonts w:ascii="Arial" w:hAnsi="Arial" w:cs="Arial"/>
-        </w:rPr>
-        <w:t xml:space="preserve">No contexto da intermediação digital entre empresas, existem plataformas que, embora não sejam concebidas especificamente para a gestão de concursos privados, desempenham um papel relevante na divulgação de oportunidades e no estabelecimento de relações comerciais. </w:t>
-      </w:r>
-    </w:p>
-    <w:p>
-      <w:pPr>
-        <w:spacing w:line="360" w:lineRule="auto"/>
-        <w:ind w:firstLine="720"/>
-        <w:jc w:val="both"/>
-        <w:rPr>
-          <w:rFonts w:ascii="Arial" w:hAnsi="Arial" w:cs="Arial"/>
-        </w:rPr>
-      </w:pPr>
-      <w:r>
-        <w:rPr>
-          <w:rFonts w:ascii="Arial" w:hAnsi="Arial" w:cs="Arial"/>
-        </w:rPr>
-        <w:t xml:space="preserve">O </w:t>
-      </w:r>
-      <w:r>
-        <w:rPr>
-          <w:rFonts w:ascii="Arial" w:hAnsi="Arial" w:cs="Arial"/>
-          <w:b/>
-          <w:bCs/>
-        </w:rPr>
-        <w:t>LinkedIn</w:t>
-      </w:r>
-      <w:r>
-        <w:rPr>
-          <w:rFonts w:ascii="Arial" w:hAnsi="Arial" w:cs="Arial"/>
-        </w:rPr>
-        <w:t>, por exemplo, actua como uma plataforma B2B de networking profissional, permitindo que organizações publiquem necessidades, procurem fornecedores e estabeleçam contactos comerciais de forma informal.</w:t>
-      </w:r>
-    </w:p>
-    <w:p>
-      <w:pPr>
-        <w:spacing w:line="360" w:lineRule="auto"/>
-        <w:ind w:firstLine="720"/>
-        <w:jc w:val="both"/>
-        <w:rPr>
-          <w:rFonts w:ascii="Arial" w:hAnsi="Arial" w:cs="Arial"/>
-        </w:rPr>
-      </w:pPr>
-      <w:r>
-        <w:rPr>
-          <w:rFonts w:ascii="Arial" w:hAnsi="Arial" w:cs="Arial"/>
-        </w:rPr>
-        <w:t xml:space="preserve">Paralelamente, plataformas como a </w:t>
-      </w:r>
-      <w:r>
-        <w:rPr>
-          <w:rFonts w:ascii="Arial" w:hAnsi="Arial" w:cs="Arial"/>
-          <w:b/>
-          <w:bCs/>
-        </w:rPr>
-        <w:t>SAP Ariba</w:t>
-      </w:r>
-      <w:r>
-        <w:rPr>
-          <w:rFonts w:ascii="Arial" w:hAnsi="Arial" w:cs="Arial"/>
-        </w:rPr>
-        <w:t xml:space="preserve"> e a </w:t>
-      </w:r>
-      <w:r>
-        <w:rPr>
-          <w:rFonts w:ascii="Arial" w:hAnsi="Arial" w:cs="Arial"/>
-          <w:b/>
-          <w:bCs/>
-        </w:rPr>
-        <w:t>Alibaba.com</w:t>
-      </w:r>
-      <w:r>
-        <w:rPr>
-          <w:rFonts w:ascii="Arial" w:hAnsi="Arial" w:cs="Arial"/>
-        </w:rPr>
-        <w:t xml:space="preserve"> demonstram a aplicação de sistemas web no suporte a processos de aquisição e negociação entre empresas, ainda que orientadas para mercados globais e organizações com maior maturidade digital.</w:t>
-      </w:r>
-    </w:p>
-    <w:p>
-      <w:pPr>
-        <w:spacing w:line="360" w:lineRule="auto"/>
-        <w:ind w:firstLine="720"/>
-        <w:jc w:val="both"/>
-        <w:rPr>
-          <w:rFonts w:ascii="Arial" w:hAnsi="Arial" w:cs="Arial"/>
-        </w:rPr>
-      </w:pPr>
-      <w:r>
-        <w:rPr>
-          <w:rFonts w:ascii="Arial" w:hAnsi="Arial" w:cs="Arial"/>
-        </w:rPr>
-        <w:t>Apesar da existência destas soluções, observa-se a ausência de plataformas especificamente concebidas para a gestão estruturada de concursos privados e processos de contratação entre pequenas e médias empresas, particularmente em contextos como o angolano, onde factores como acesso à informação, sim</w:t>
-      </w:r>
-      <w:r>
-        <w:rPr>
-          <w:rFonts w:ascii="Arial" w:hAnsi="Arial" w:cs="Arial"/>
-        </w:rPr>
-        <w:t>plicidadde e custos operacionais</w:t>
-      </w:r>
-      <w:r>
-        <w:rPr>
-          <w:rFonts w:ascii="Arial" w:hAnsi="Arial" w:cs="Arial"/>
-        </w:rPr>
-        <w:t xml:space="preserve"> adequa</w:t>
-      </w:r>
-      <w:r>
-        <w:rPr>
-          <w:rFonts w:ascii="Arial" w:hAnsi="Arial" w:cs="Arial"/>
-        </w:rPr>
-        <w:t>dos</w:t>
-      </w:r>
-      <w:r>
-        <w:rPr>
-          <w:rFonts w:ascii="Arial" w:hAnsi="Arial" w:cs="Arial"/>
-        </w:rPr>
-        <w:t xml:space="preserve"> ao contexto local são determinantes.</w:t>
-      </w:r>
-    </w:p>
-    <w:p>
-      <w:pPr>
-        <w:pStyle w:val="Ttulo2"/>
-        <w:spacing w:line="360" w:lineRule="auto"/>
+      <w:r>
         <w:rPr>
           <w:rFonts w:ascii="Arial" w:hAnsi="Arial" w:cs="Arial"/>
           <w:b/>
@@ -6309,9 +6797,127 @@
           <w:sz w:val="24"/>
           <w:szCs w:val="24"/>
         </w:rPr>
+        <w:t>ESTADO DA ARTE</w:t>
+      </w:r>
+    </w:p>
+    <w:p>
+      <w:pPr>
+        <w:spacing w:line="360" w:lineRule="auto"/>
+        <w:ind w:firstLine="720"/>
+        <w:jc w:val="both"/>
+        <w:rPr>
+          <w:rFonts w:ascii="Arial" w:hAnsi="Arial" w:cs="Arial"/>
+        </w:rPr>
       </w:pPr>
       <w:bookmarkStart w:id="18" w:name="_Toc224021885"/>
       <w:r>
+        <w:rPr>
+          <w:rFonts w:ascii="Arial" w:hAnsi="Arial" w:cs="Arial"/>
+        </w:rPr>
+        <w:t>No contexto nacional, o maior referencial tecnológico na centralização, divulgação de oportunidades e gestão de fornecedores é o Portal da Contratação Pública (PCP), administrado pelo Serviço Nacional da Contratação Pública do Ministério das Finanças (SNCP). Este portal opera estritamente num modelo Business-to-Government (B2G) e funciona como um repositório oficial obrigatório onde as Entidades Públicas Contratantes procedem à publicação das suas necessidades de aquisição e anúncios de procedimentos concursais (Ministério das Finanças, 2024).</w:t>
+      </w:r>
+    </w:p>
+    <w:p>
+      <w:pPr>
+        <w:spacing w:line="360" w:lineRule="auto"/>
+        <w:ind w:firstLine="720"/>
+        <w:jc w:val="both"/>
+        <w:rPr>
+          <w:rFonts w:ascii="Arial" w:hAnsi="Arial" w:cs="Arial"/>
+        </w:rPr>
+      </w:pPr>
+      <w:r>
+        <w:rPr>
+          <w:rFonts w:ascii="Arial" w:hAnsi="Arial" w:cs="Arial"/>
+        </w:rPr>
+        <w:t>Para acederem a estas oportunidades, a plataforma governamental estabelece um fluxo estruturado e exigente: as empresas, incluindo as pequenas e médias empresas (PMEs), devem realizar um cadastro formal que engloba o registo de utilizador, o carregamento de documentação legal e fiscal e a submissão para análise, culminando na emissão do Certificado de Fornecedor do Estado (SNCP, 202</w:t>
+      </w:r>
+      <w:r>
+        <w:rPr>
+          <w:rFonts w:ascii="Arial" w:hAnsi="Arial" w:cs="Arial"/>
+        </w:rPr>
+        <w:t>6</w:t>
+      </w:r>
+      <w:r>
+        <w:rPr>
+          <w:rFonts w:ascii="Arial" w:hAnsi="Arial" w:cs="Arial"/>
+        </w:rPr>
+        <w:t xml:space="preserve">). </w:t>
+      </w:r>
+    </w:p>
+    <w:p>
+      <w:pPr>
+        <w:spacing w:line="360" w:lineRule="auto"/>
+        <w:ind w:firstLine="720"/>
+        <w:jc w:val="both"/>
+        <w:rPr>
+          <w:rFonts w:ascii="Arial" w:hAnsi="Arial" w:cs="Arial"/>
+        </w:rPr>
+      </w:pPr>
+      <w:r>
+        <w:rPr>
+          <w:rFonts w:ascii="Arial" w:hAnsi="Arial" w:cs="Arial"/>
+        </w:rPr>
+        <w:t xml:space="preserve">Contudo, a governação e o acesso a este portal limitam-se ao relacionamento entre as entidades do Estado e o sector privado. Ao transitar para as relações comerciais que ocorrem exclusivamente dentro do tecido empresarial privado — o modelo Business-to-Business (B2B) —, regista-se um </w:t>
+      </w:r>
+      <w:r>
+        <w:rPr>
+          <w:rFonts w:ascii="Arial" w:hAnsi="Arial" w:cs="Arial"/>
+        </w:rPr>
+        <w:lastRenderedPageBreak/>
+        <w:t>acentuado vazio tecnológico e processual em Angola. Apesar de as PMEs angolanas já demonstrarem capacidade de compliance para fornecer o Estado, deparam-se com a ausência de um ecossistema equivalente que lhes permita consultar, de forma centralizada, as necessidades e os concursos privados promovidos por médias e grandes empresas corporativas no país.</w:t>
+      </w:r>
+    </w:p>
+    <w:p>
+      <w:pPr>
+        <w:spacing w:line="360" w:lineRule="auto"/>
+        <w:ind w:firstLine="720"/>
+        <w:jc w:val="both"/>
+        <w:rPr>
+          <w:rFonts w:ascii="Arial" w:hAnsi="Arial" w:cs="Arial"/>
+        </w:rPr>
+      </w:pPr>
+      <w:r>
+        <w:rPr>
+          <w:rFonts w:ascii="Arial" w:hAnsi="Arial" w:cs="Arial"/>
+        </w:rPr>
+        <w:t xml:space="preserve">Na ausência de sistemas informacionais (SI) desenhados expressamente para apoiar o ciclo de compras empresariais B2B, a necessidade de intermediação digital tem sido suprida por recursos informais ou plataformas genéricas. O </w:t>
+      </w:r>
+      <w:r>
+        <w:rPr>
+          <w:rFonts w:ascii="Arial" w:hAnsi="Arial" w:cs="Arial"/>
+          <w:b/>
+          <w:bCs/>
+        </w:rPr>
+        <w:t>LinkedIn</w:t>
+      </w:r>
+      <w:r>
+        <w:rPr>
+          <w:rFonts w:ascii="Arial" w:hAnsi="Arial" w:cs="Arial"/>
+        </w:rPr>
+        <w:t>, por exemplo, consolidou-se global e localmente como a principal rede social corporativa, facilitando o networking e o estabelecimento de identidades profissionais (Cortez &amp; Johnston, 2017). Embora a sua arquitectura permita que empresas anunciem informalmente necessidades de aquisição e procurem potenciais fornecedores através de interações passivas, a plataforma não concebe a funcionalidade de transação e execução de processos de compra: carece de mecanismos para a submissão estruturada de propostas comerciais (cotações), não fornece recursos de validação de compliance legal das empresas e não oferece ferramentas de avaliação comparativa ou adjudicação formal.</w:t>
+      </w:r>
+    </w:p>
+    <w:p>
+      <w:pPr>
+        <w:spacing w:line="360" w:lineRule="auto"/>
+        <w:ind w:firstLine="720"/>
+        <w:jc w:val="both"/>
+        <w:rPr>
+          <w:rFonts w:ascii="Arial" w:hAnsi="Arial" w:cs="Arial"/>
+        </w:rPr>
+      </w:pPr>
+      <w:r>
+        <w:rPr>
+          <w:rFonts w:ascii="Arial" w:hAnsi="Arial" w:cs="Arial"/>
+        </w:rPr>
+        <w:t>Existe, portanto, uma clara discrepância entre a maturidade dos sistemas de informação na contratação B2G e a desestruturação dos processos de contratação B2B entre PMEs (Mwafufyomwenyo &amp; Ndeunyema, 2025). É exactamente sobre esta lacuna processual e tecnológica que a presente investigação se posiciona: transpor as melhores práticas de transparência, gestão documental de fornecedores e divulgação equitativa de oportunidades, validadas no panorama público, agregando-as numa plataforma digital B2B ágil e vocacionada exclusivamente para os "concursos privados" e a contratação entre empresas em Angola.</w:t>
+      </w:r>
+    </w:p>
+    <w:p>
+      <w:pPr>
+        <w:pStyle w:val="Ttulo2"/>
+        <w:spacing w:line="360" w:lineRule="auto"/>
         <w:rPr>
           <w:rFonts w:ascii="Arial" w:hAnsi="Arial" w:cs="Arial"/>
           <w:b/>
@@ -6320,9 +6926,7 @@
           <w:sz w:val="24"/>
           <w:szCs w:val="24"/>
         </w:rPr>
-        <w:lastRenderedPageBreak/>
-        <w:t>4</w:t>
-      </w:r>
+      </w:pPr>
       <w:r>
         <w:rPr>
           <w:rFonts w:ascii="Arial" w:hAnsi="Arial" w:cs="Arial"/>
@@ -6332,87 +6936,9 @@
           <w:sz w:val="24"/>
           <w:szCs w:val="24"/>
         </w:rPr>
-        <w:t>.5 ELABORAÇÃO DAS HIPÓTESES</w:t>
-      </w:r>
-      <w:bookmarkEnd w:id="18"/>
-    </w:p>
-    <w:p>
-      <w:pPr>
-        <w:spacing w:line="360" w:lineRule="auto"/>
-        <w:ind w:firstLine="720"/>
-        <w:jc w:val="both"/>
-        <w:rPr>
-          <w:rFonts w:ascii="Arial" w:hAnsi="Arial" w:cs="Arial"/>
-        </w:rPr>
-      </w:pPr>
-      <w:r>
-        <w:rPr>
-          <w:rFonts w:ascii="Arial" w:hAnsi="Arial" w:cs="Arial"/>
-          <w:b/>
-          <w:bCs/>
-        </w:rPr>
-        <w:t>H1:</w:t>
-      </w:r>
-      <w:r>
-        <w:rPr>
-          <w:rFonts w:ascii="Arial" w:hAnsi="Arial" w:cs="Arial"/>
-        </w:rPr>
-        <w:t xml:space="preserve"> A utilização de uma plataforma digital centralizada aumenta o acesso das PMEs à informação sobre oportunidades de concursos privados.</w:t>
-      </w:r>
-    </w:p>
-    <w:p>
-      <w:pPr>
-        <w:spacing w:line="360" w:lineRule="auto"/>
-        <w:ind w:firstLine="720"/>
-        <w:jc w:val="both"/>
-        <w:rPr>
-          <w:rFonts w:ascii="Arial" w:hAnsi="Arial" w:cs="Arial"/>
-        </w:rPr>
-      </w:pPr>
-      <w:r>
-        <w:rPr>
-          <w:rFonts w:ascii="Arial" w:hAnsi="Arial" w:cs="Arial"/>
-          <w:b/>
-          <w:bCs/>
-        </w:rPr>
-        <w:t xml:space="preserve">H2: </w:t>
-      </w:r>
-      <w:r>
-        <w:rPr>
-          <w:rFonts w:ascii="Arial" w:hAnsi="Arial" w:cs="Arial"/>
-        </w:rPr>
-        <w:t>A gestão digital de concursos privados contribui para a redução da informalidade e para a melhoria da eficiência no acompanhamento das candidaturas.</w:t>
-      </w:r>
-    </w:p>
-    <w:p>
-      <w:pPr>
-        <w:spacing w:line="360" w:lineRule="auto"/>
-        <w:ind w:firstLine="720"/>
-        <w:jc w:val="both"/>
-        <w:rPr>
-          <w:rFonts w:ascii="Arial" w:hAnsi="Arial" w:cs="Arial"/>
-        </w:rPr>
-      </w:pPr>
-      <w:r>
-        <w:rPr>
-          <w:rFonts w:ascii="Arial" w:hAnsi="Arial" w:cs="Arial"/>
-          <w:b/>
-          <w:bCs/>
-        </w:rPr>
-        <w:t xml:space="preserve">H3: </w:t>
-      </w:r>
-      <w:r>
-        <w:rPr>
-          <w:rFonts w:ascii="Arial" w:hAnsi="Arial" w:cs="Arial"/>
-        </w:rPr>
-        <w:t>A integração de painéis de gestão (dashboards) e mecanismos de análise comparativa apoia a tomada de decisão das PMEs contratantes.</w:t>
-      </w:r>
-    </w:p>
-    <w:p>
-      <w:pPr>
-        <w:pStyle w:val="Ttulo2"/>
-        <w:spacing w:line="360" w:lineRule="auto"/>
-        <w:jc w:val="both"/>
+        <w:t>4</w:t>
+      </w:r>
+      <w:r>
         <w:rPr>
           <w:rFonts w:ascii="Arial" w:hAnsi="Arial" w:cs="Arial"/>
           <w:b/>
@@ -6421,9 +6947,88 @@
           <w:sz w:val="24"/>
           <w:szCs w:val="24"/>
         </w:rPr>
-      </w:pPr>
-      <w:bookmarkStart w:id="19" w:name="_Toc224021886"/>
-      <w:r>
+        <w:t>.5 ELABORAÇÃO DAS HIPÓTESES</w:t>
+      </w:r>
+      <w:bookmarkEnd w:id="18"/>
+    </w:p>
+    <w:p>
+      <w:pPr>
+        <w:spacing w:line="360" w:lineRule="auto"/>
+        <w:ind w:firstLine="720"/>
+        <w:jc w:val="both"/>
+        <w:rPr>
+          <w:rFonts w:ascii="Arial" w:hAnsi="Arial" w:cs="Arial"/>
+        </w:rPr>
+      </w:pPr>
+      <w:r>
+        <w:rPr>
+          <w:rFonts w:ascii="Arial" w:hAnsi="Arial" w:cs="Arial"/>
+          <w:b/>
+          <w:bCs/>
+        </w:rPr>
+        <w:t>H1:</w:t>
+      </w:r>
+      <w:r>
+        <w:rPr>
+          <w:rFonts w:ascii="Arial" w:hAnsi="Arial" w:cs="Arial"/>
+        </w:rPr>
+        <w:t xml:space="preserve"> A utilização de uma plataforma digital centralizada aumenta o acesso das PMEs à informação sobre oportunidades de concursos privados.</w:t>
+      </w:r>
+    </w:p>
+    <w:p>
+      <w:pPr>
+        <w:spacing w:line="360" w:lineRule="auto"/>
+        <w:ind w:firstLine="720"/>
+        <w:jc w:val="both"/>
+        <w:rPr>
+          <w:rFonts w:ascii="Arial" w:hAnsi="Arial" w:cs="Arial"/>
+        </w:rPr>
+      </w:pPr>
+      <w:r>
+        <w:rPr>
+          <w:rFonts w:ascii="Arial" w:hAnsi="Arial" w:cs="Arial"/>
+          <w:b/>
+          <w:bCs/>
+        </w:rPr>
+        <w:lastRenderedPageBreak/>
+        <w:t xml:space="preserve">H2: </w:t>
+      </w:r>
+      <w:r>
+        <w:rPr>
+          <w:rFonts w:ascii="Arial" w:hAnsi="Arial" w:cs="Arial"/>
+        </w:rPr>
+        <w:t>A gestão digital de concursos privados contribui para a redução da informalidade e para a melhoria da eficiência no acompanhamento das candidaturas.</w:t>
+      </w:r>
+    </w:p>
+    <w:p>
+      <w:pPr>
+        <w:spacing w:line="360" w:lineRule="auto"/>
+        <w:ind w:firstLine="720"/>
+        <w:jc w:val="both"/>
+        <w:rPr>
+          <w:rFonts w:ascii="Arial" w:hAnsi="Arial" w:cs="Arial"/>
+        </w:rPr>
+      </w:pPr>
+      <w:r>
+        <w:rPr>
+          <w:rFonts w:ascii="Arial" w:hAnsi="Arial" w:cs="Arial"/>
+          <w:b/>
+          <w:bCs/>
+        </w:rPr>
+        <w:t xml:space="preserve">H3: </w:t>
+      </w:r>
+      <w:r>
+        <w:rPr>
+          <w:rFonts w:ascii="Arial" w:hAnsi="Arial" w:cs="Arial"/>
+        </w:rPr>
+        <w:t>A integração de painéis de gestão (dashboards) e mecanismos de análise comparativa apoia a tomada de decisão das PMEs contratantes.</w:t>
+      </w:r>
+    </w:p>
+    <w:p>
+      <w:pPr>
+        <w:pStyle w:val="Ttulo2"/>
+        <w:spacing w:line="360" w:lineRule="auto"/>
+        <w:jc w:val="both"/>
         <w:rPr>
           <w:rFonts w:ascii="Arial" w:hAnsi="Arial" w:cs="Arial"/>
           <w:b/>
@@ -6432,8 +7037,8 @@
           <w:sz w:val="24"/>
           <w:szCs w:val="24"/>
         </w:rPr>
-        <w:t>4</w:t>
-      </w:r>
+      </w:pPr>
+      <w:bookmarkStart w:id="19" w:name="_Toc224021886"/>
       <w:r>
         <w:rPr>
           <w:rFonts w:ascii="Arial" w:hAnsi="Arial" w:cs="Arial"/>
@@ -6443,6 +7048,17 @@
           <w:sz w:val="24"/>
           <w:szCs w:val="24"/>
         </w:rPr>
+        <w:t>4</w:t>
+      </w:r>
+      <w:r>
+        <w:rPr>
+          <w:rFonts w:ascii="Arial" w:hAnsi="Arial" w:cs="Arial"/>
+          <w:b/>
+          <w:bCs/>
+          <w:color w:val="000000" w:themeColor="text1"/>
+          <w:sz w:val="24"/>
+          <w:szCs w:val="24"/>
+        </w:rPr>
         <w:t>.6 IDENTIFICAÇÃO DAS VARIÁVEIS DA INVESTIGAÇÃO</w:t>
       </w:r>
       <w:bookmarkEnd w:id="19"/>
@@ -6476,20 +7092,10 @@
         <w:jc w:val="both"/>
         <w:rPr>
           <w:rFonts w:ascii="Arial" w:hAnsi="Arial" w:cs="Arial"/>
-        </w:rPr>
-      </w:pPr>
-    </w:p>
-    <w:p>
-      <w:pPr>
-        <w:spacing w:line="360" w:lineRule="auto"/>
-        <w:jc w:val="both"/>
-        <w:rPr>
-          <w:rFonts w:ascii="Arial" w:hAnsi="Arial" w:cs="Arial"/>
-          <w:b/>
-          <w:bCs/>
-        </w:rPr>
-      </w:pPr>
-      <w:proofErr w:type="gramStart"/>
+          <w:b/>
+          <w:bCs/>
+        </w:rPr>
+      </w:pPr>
       <w:r>
         <w:rPr>
           <w:rFonts w:ascii="Arial" w:hAnsi="Arial" w:cs="Arial"/>
@@ -6498,7 +7104,6 @@
         </w:rPr>
         <w:t>Variáveis Dependentes</w:t>
       </w:r>
-      <w:proofErr w:type="gramEnd"/>
       <w:r>
         <w:rPr>
           <w:rFonts w:ascii="Arial" w:hAnsi="Arial" w:cs="Arial"/>
@@ -6728,14 +7333,7 @@
         <w:rPr>
           <w:rFonts w:ascii="Arial" w:hAnsi="Arial" w:cs="Arial"/>
         </w:rPr>
-        <w:t xml:space="preserve">Do ponto de vista da forma de abordagem ao problema, adoptou-se uma abordagem mista, isto é, qualitativa e quantitativa, usando ferramentas de ambas para enriquecer a pesquisa, a interpretação de dados qualitativos baseia-se na observação e uma interação participativa. Quanto aos dados quantitativos, a sua </w:t>
-      </w:r>
-      <w:r>
-        <w:rPr>
-          <w:rFonts w:ascii="Arial" w:hAnsi="Arial" w:cs="Arial"/>
-        </w:rPr>
-        <w:lastRenderedPageBreak/>
-        <w:t>interpretação se baseia unicamente em técnicas estatísticas e símbolos numéricos.</w:t>
+        <w:t>Do ponto de vista da forma de abordagem ao problema, adoptou-se uma abordagem mista, isto é, qualitativa e quantitativa, usando ferramentas de ambas para enriquecer a pesquisa, a interpretação de dados qualitativos baseia-se na observação e uma interação participativa. Quanto aos dados quantitativos, a sua interpretação se baseia unicamente em técnicas estatísticas e símbolos numéricos.</w:t>
       </w:r>
     </w:p>
     <w:p>
@@ -6783,6 +7381,7 @@
           <w:sz w:val="24"/>
           <w:szCs w:val="24"/>
         </w:rPr>
+        <w:lastRenderedPageBreak/>
         <w:t>5</w:t>
       </w:r>
       <w:r>
@@ -7022,21 +7621,7 @@
         <w:rPr>
           <w:rFonts w:ascii="Arial" w:hAnsi="Arial" w:cs="Arial"/>
         </w:rPr>
-        <w:t xml:space="preserve">Como instrumento quantitativo, utiliza-se um questionário estruturado, composto essencialmente por perguntas fechadas e escalas de resposta, com o objetivo de identificar a frequência e as formas de acesso das PMEs </w:t>
-      </w:r>
-      <w:proofErr w:type="gramStart"/>
-      <w:r>
-        <w:rPr>
-          <w:rFonts w:ascii="Arial" w:hAnsi="Arial" w:cs="Arial"/>
-        </w:rPr>
-        <w:t>à</w:t>
-      </w:r>
-      <w:proofErr w:type="gramEnd"/>
-      <w:r>
-        <w:rPr>
-          <w:rFonts w:ascii="Arial" w:hAnsi="Arial" w:cs="Arial"/>
-        </w:rPr>
-        <w:t xml:space="preserve"> oportunidades de contratação, avaliar a utilização actual de ferramentas digitais, recolher percepções gerais sobre a utilidade de uma plataforma digital B2B.</w:t>
+        <w:t>Como instrumento quantitativo, utiliza-se um questionário estruturado, composto essencialmente por perguntas fechadas e escalas de resposta, com o objetivo de identificar a frequência e as formas de acesso das PMEs à oportunidades de contratação, avaliar a utilização actual de ferramentas digitais, recolher percepções gerais sobre a utilidade de uma plataforma digital B2B.</w:t>
       </w:r>
     </w:p>
     <w:p>
@@ -7052,7 +7637,6 @@
         <w:rPr>
           <w:rFonts w:ascii="Arial" w:hAnsi="Arial" w:cs="Arial"/>
         </w:rPr>
-        <w:lastRenderedPageBreak/>
         <w:t>Os dados recolhidos por meio do questionário são tratados através de técnicas estatísticas descritivas, recorrendo a símbolos numéricos, conforme definido na abordagem quantitativa do estudo.</w:t>
       </w:r>
     </w:p>
@@ -7118,7 +7702,14 @@
         <w:rPr>
           <w:rFonts w:ascii="Arial" w:hAnsi="Arial" w:cs="Arial"/>
         </w:rPr>
-        <w:t>A população da presente investigação é constituída por pequenas e médias empresas (PME) em Angola que actuam no sector privado, enquanto potenciais contratantes ou fornecedoras de bens e serviços, e que participam ou pretendem participar em processos de concursos privados e contratação empresarial.</w:t>
+        <w:t xml:space="preserve">A população da presente investigação é constituída por pequenas e médias empresas (PME) em Angola que actuam no sector privado, enquanto </w:t>
+      </w:r>
+      <w:r>
+        <w:rPr>
+          <w:rFonts w:ascii="Arial" w:hAnsi="Arial" w:cs="Arial"/>
+        </w:rPr>
+        <w:lastRenderedPageBreak/>
+        <w:t>potenciais contratantes ou fornecedoras de bens e serviços, e que participam ou pretendem participar em processos de concursos privados e contratação empresarial.</w:t>
       </w:r>
     </w:p>
     <w:p>
@@ -7376,7 +7967,6 @@
         <w:rPr>
           <w:rFonts w:ascii="Arial" w:hAnsi="Arial" w:cs="Arial"/>
         </w:rPr>
-        <w:lastRenderedPageBreak/>
         <w:t>Forma de divulgação de oportunidades de aquisição ou prestação de serviços</w:t>
       </w:r>
       <w:r>
@@ -7479,6 +8069,7 @@
         <w:rPr>
           <w:rFonts w:ascii="Arial" w:hAnsi="Arial" w:cs="Arial"/>
         </w:rPr>
+        <w:lastRenderedPageBreak/>
         <w:t>Fontes utilizadas para identificar oportunidades de concursos privados</w:t>
       </w:r>
       <w:r>
@@ -7842,49 +8433,7 @@
         <w:rPr>
           <w:rFonts w:ascii="Arial" w:hAnsi="Arial" w:cs="Arial"/>
         </w:rPr>
-        <w:t xml:space="preserve">Assembleia Nacional de Angola. (2011). Lei n.º 30/11, de 13 de setembro. </w:t>
-      </w:r>
-      <w:r>
-        <w:fldChar w:fldCharType="begin"/>
-      </w:r>
-      <w:r>
-        <w:instrText>HYPERLINK "https://lex.ao/docs/assembleia-nacional/2011/lei-n-o-30-11-de-13-de-setembro"</w:instrText>
-      </w:r>
-      <w:r>
-        <w:fldChar w:fldCharType="separate"/>
-      </w:r>
-      <w:r>
-        <w:rPr>
-          <w:rStyle w:val="Hiperligao"/>
-          <w:rFonts w:ascii="Arial" w:hAnsi="Arial" w:cs="Arial"/>
-        </w:rPr>
-        <w:t>https://lex.ao/docs/assembleia-nacional/2011/lei-n-o-30-11-de-13-de-setembro</w:t>
-      </w:r>
-      <w:r>
-        <w:fldChar w:fldCharType="end"/>
-      </w:r>
-    </w:p>
-    <w:p>
-      <w:pPr>
-        <w:spacing w:line="360" w:lineRule="auto"/>
-        <w:jc w:val="both"/>
-        <w:rPr>
-          <w:rFonts w:ascii="Arial" w:hAnsi="Arial" w:cs="Arial"/>
-        </w:rPr>
-      </w:pPr>
-      <w:r>
-        <w:rPr>
-          <w:rFonts w:ascii="Arial" w:hAnsi="Arial" w:cs="Arial"/>
-          <w:b/>
-          <w:bCs/>
-        </w:rPr>
-        <w:t>INAPEM – Instituto Nacional de Apoio a Micro, Pequenas e Médias Empresas.</w:t>
-      </w:r>
-      <w:r>
-        <w:rPr>
-          <w:rFonts w:ascii="Arial" w:hAnsi="Arial" w:cs="Arial"/>
-        </w:rPr>
-        <w:t xml:space="preserve"> (2025). </w:t>
+        <w:t xml:space="preserve">Angola. (2011). </w:t>
       </w:r>
       <w:r>
         <w:rPr>
@@ -7892,6 +8441,64 @@
           <w:i/>
           <w:iCs/>
         </w:rPr>
+        <w:t>Lei n.º 30/11, de 13 de setembro</w:t>
+      </w:r>
+      <w:r>
+        <w:rPr>
+          <w:rFonts w:ascii="Arial" w:hAnsi="Arial" w:cs="Arial"/>
+        </w:rPr>
+        <w:t xml:space="preserve">. Diário da República. </w:t>
+      </w:r>
+      <w:r>
+        <w:rPr>
+          <w:rFonts w:ascii="Arial" w:hAnsi="Arial" w:cs="Arial"/>
+        </w:rPr>
+        <w:t>I Série, n.º 176</w:t>
+      </w:r>
+      <w:r>
+        <w:rPr>
+          <w:rFonts w:ascii="Arial" w:hAnsi="Arial" w:cs="Arial"/>
+        </w:rPr>
+        <w:t>.</w:t>
+      </w:r>
+      <w:hyperlink r:id="rId10" w:history="1">
+        <w:r>
+          <w:rPr>
+            <w:rStyle w:val="Hiperligao"/>
+            <w:rFonts w:ascii="Arial" w:hAnsi="Arial" w:cs="Arial"/>
+          </w:rPr>
+          <w:t>https://www.cmc.ao/sites/default/files/2024-08/Lei%20das%20MPME%20n.%C2%BA%2030-11.pdf</w:t>
+        </w:r>
+      </w:hyperlink>
+    </w:p>
+    <w:p>
+      <w:pPr>
+        <w:spacing w:line="360" w:lineRule="auto"/>
+        <w:jc w:val="both"/>
+        <w:rPr>
+          <w:rFonts w:ascii="Arial" w:hAnsi="Arial" w:cs="Arial"/>
+        </w:rPr>
+      </w:pPr>
+      <w:r>
+        <w:rPr>
+          <w:rFonts w:ascii="Arial" w:hAnsi="Arial" w:cs="Arial"/>
+          <w:b/>
+          <w:bCs/>
+        </w:rPr>
+        <w:t>INAPEM – Instituto Nacional de Apoio a Micro, Pequenas e Médias Empresas.</w:t>
+      </w:r>
+      <w:r>
+        <w:rPr>
+          <w:rFonts w:ascii="Arial" w:hAnsi="Arial" w:cs="Arial"/>
+        </w:rPr>
+        <w:t xml:space="preserve"> (2025). </w:t>
+      </w:r>
+      <w:r>
+        <w:rPr>
+          <w:rFonts w:ascii="Arial" w:hAnsi="Arial" w:cs="Arial"/>
+          <w:i/>
+          <w:iCs/>
+        </w:rPr>
         <w:t>Página oficial</w:t>
       </w:r>
       <w:r>
@@ -7900,7 +8507,7 @@
         </w:rPr>
         <w:t xml:space="preserve">. </w:t>
       </w:r>
-      <w:hyperlink r:id="rId10" w:tgtFrame="_new" w:history="1">
+      <w:hyperlink r:id="rId11" w:tgtFrame="_new" w:history="1">
         <w:r>
           <w:rPr>
             <w:rStyle w:val="Hiperligao"/>
@@ -7961,7 +8568,6 @@
           <w:b/>
           <w:bCs/>
         </w:rPr>
-        <w:lastRenderedPageBreak/>
         <w:t>Mwafufyomwenyo, A. T., &amp; Ndeunyema, D. N. N.</w:t>
       </w:r>
       <w:r>
@@ -8000,47 +8606,7 @@
           <w:bCs/>
           <w:lang w:val="pt-PT"/>
         </w:rPr>
-        <w:t xml:space="preserve">Parker, G. G., Van </w:t>
-      </w:r>
-      <w:proofErr w:type="spellStart"/>
-      <w:r>
-        <w:rPr>
-          <w:rFonts w:ascii="Arial" w:hAnsi="Arial" w:cs="Arial"/>
-          <w:b/>
-          <w:bCs/>
-          <w:lang w:val="pt-PT"/>
-        </w:rPr>
-        <w:t>Alstyne</w:t>
-      </w:r>
-      <w:proofErr w:type="spellEnd"/>
-      <w:r>
-        <w:rPr>
-          <w:rFonts w:ascii="Arial" w:hAnsi="Arial" w:cs="Arial"/>
-          <w:b/>
-          <w:bCs/>
-          <w:lang w:val="pt-PT"/>
-        </w:rPr>
-        <w:t xml:space="preserve">, M. W., &amp; </w:t>
-      </w:r>
-      <w:proofErr w:type="spellStart"/>
-      <w:r>
-        <w:rPr>
-          <w:rFonts w:ascii="Arial" w:hAnsi="Arial" w:cs="Arial"/>
-          <w:b/>
-          <w:bCs/>
-          <w:lang w:val="pt-PT"/>
-        </w:rPr>
-        <w:t>Choudary</w:t>
-      </w:r>
-      <w:proofErr w:type="spellEnd"/>
-      <w:r>
-        <w:rPr>
-          <w:rFonts w:ascii="Arial" w:hAnsi="Arial" w:cs="Arial"/>
-          <w:b/>
-          <w:bCs/>
-          <w:lang w:val="pt-PT"/>
-        </w:rPr>
-        <w:t>, S. P.</w:t>
+        <w:t>Parker, G. G., Van Alstyne, M. W., &amp; Choudary, S. P.</w:t>
       </w:r>
       <w:r>
         <w:rPr>
@@ -8078,6 +8644,7 @@
           <w:b/>
           <w:bCs/>
         </w:rPr>
+        <w:lastRenderedPageBreak/>
         <w:t>Chiarini, T., Silva Neto, V. J. da, Pereira, L. de S., &amp; Szigethy, L.</w:t>
       </w:r>
       <w:r>
@@ -8100,7 +8667,7 @@
         </w:rPr>
         <w:t xml:space="preserve"> [Texto para discussão]. Instituto de Pesquisa Econômica Aplicada. </w:t>
       </w:r>
-      <w:hyperlink r:id="rId11" w:tgtFrame="_new" w:history="1">
+      <w:hyperlink r:id="rId12" w:tgtFrame="_new" w:history="1">
         <w:r>
           <w:rPr>
             <w:rStyle w:val="Hiperligao"/>
@@ -8149,7 +8716,7 @@
         </w:rPr>
         <w:t xml:space="preserve">(13), 232–254. </w:t>
       </w:r>
-      <w:hyperlink r:id="rId12" w:history="1">
+      <w:hyperlink r:id="rId13" w:history="1">
         <w:r>
           <w:rPr>
             <w:rStyle w:val="Hiperligao"/>
@@ -8203,7 +8770,7 @@
         </w:rPr>
         <w:t xml:space="preserve"> (Tese de doutorado, Escola Politécnica, University of São Paulo).        </w:t>
       </w:r>
-      <w:hyperlink r:id="rId13" w:history="1">
+      <w:hyperlink r:id="rId14" w:history="1">
         <w:r>
           <w:rPr>
             <w:rStyle w:val="Hiperligao"/>
@@ -8328,56 +8895,225 @@
       <w:pPr>
         <w:rPr>
           <w:rFonts w:ascii="Arial" w:hAnsi="Arial" w:cs="Arial"/>
-        </w:rPr>
-      </w:pPr>
-    </w:p>
-    <w:p>
-      <w:pPr>
-        <w:rPr>
-          <w:rFonts w:ascii="Arial" w:hAnsi="Arial" w:cs="Arial"/>
-          <w:lang w:val="pt-PT"/>
-        </w:rPr>
-      </w:pPr>
-    </w:p>
-    <w:p>
-      <w:pPr>
-        <w:rPr>
-          <w:rFonts w:ascii="Arial" w:hAnsi="Arial" w:cs="Arial"/>
-          <w:lang w:val="pt-PT"/>
-        </w:rPr>
-      </w:pPr>
-    </w:p>
-    <w:p>
-      <w:pPr>
-        <w:rPr>
-          <w:rFonts w:ascii="Arial" w:hAnsi="Arial" w:cs="Arial"/>
-          <w:lang w:val="pt-PT"/>
-        </w:rPr>
-      </w:pPr>
-    </w:p>
-    <w:p>
-      <w:pPr>
-        <w:rPr>
-          <w:rFonts w:ascii="Arial" w:hAnsi="Arial" w:cs="Arial"/>
-          <w:lang w:val="pt-PT"/>
-        </w:rPr>
-      </w:pPr>
-    </w:p>
-    <w:p>
-      <w:pPr>
-        <w:rPr>
-          <w:rFonts w:ascii="Arial" w:hAnsi="Arial" w:cs="Arial"/>
-          <w:lang w:val="pt-PT"/>
-        </w:rPr>
-      </w:pPr>
+          <w:lang w:val="pt-PT"/>
+        </w:rPr>
+      </w:pPr>
+      <w:r>
+        <w:rPr>
+          <w:rFonts w:ascii="Arial" w:hAnsi="Arial" w:cs="Arial"/>
+        </w:rPr>
+        <w:t xml:space="preserve">Amaral, L. A., Teixeira, C., &amp; Oliveira, J. N. (2003). </w:t>
+      </w:r>
+      <w:r>
+        <w:rPr>
+          <w:rFonts w:ascii="Arial" w:hAnsi="Arial" w:cs="Arial"/>
+          <w:i/>
+          <w:iCs/>
+        </w:rPr>
+        <w:t>E-procurement: Uma reflexão sobre a situação actual em Portugal</w:t>
+      </w:r>
+      <w:r>
+        <w:rPr>
+          <w:rFonts w:ascii="Arial" w:hAnsi="Arial" w:cs="Arial"/>
+        </w:rPr>
+        <w:t>. Associação para a Promoção e Desenvolvimento da Sociedade da Informação.</w:t>
+      </w:r>
+    </w:p>
+    <w:p>
+      <w:pPr>
+        <w:rPr>
+          <w:rFonts w:ascii="Arial" w:hAnsi="Arial" w:cs="Arial"/>
+          <w:lang w:val="en-US"/>
+        </w:rPr>
+      </w:pPr>
+      <w:r>
+        <w:rPr>
+          <w:rFonts w:ascii="Arial" w:hAnsi="Arial" w:cs="Arial"/>
+          <w:lang w:val="en-US"/>
+        </w:rPr>
+        <w:t>OECD (2023), </w:t>
+      </w:r>
+      <w:r>
+        <w:rPr>
+          <w:rFonts w:ascii="Arial" w:hAnsi="Arial" w:cs="Arial"/>
+          <w:i/>
+          <w:iCs/>
+          <w:lang w:val="en-US"/>
+        </w:rPr>
+        <w:t>Government at a Glance 2023</w:t>
+      </w:r>
+      <w:r>
+        <w:rPr>
+          <w:rFonts w:ascii="Arial" w:hAnsi="Arial" w:cs="Arial"/>
+          <w:lang w:val="en-US"/>
+        </w:rPr>
+        <w:t>, OECD Publishing, Paris, </w:t>
+      </w:r>
+      <w:hyperlink r:id="rId15" w:history="1">
+        <w:r>
+          <w:rPr>
+            <w:rStyle w:val="Hiperligao"/>
+            <w:rFonts w:ascii="Arial" w:hAnsi="Arial" w:cs="Arial"/>
+            <w:lang w:val="en-US"/>
+          </w:rPr>
+          <w:t>https://doi.org/10.1787/3d5c5d31-en</w:t>
+        </w:r>
+      </w:hyperlink>
+      <w:r>
+        <w:rPr>
+          <w:rFonts w:ascii="Arial" w:hAnsi="Arial" w:cs="Arial"/>
+          <w:lang w:val="en-US"/>
+        </w:rPr>
+        <w:t>.</w:t>
+      </w:r>
+    </w:p>
+    <w:p>
+      <w:pPr>
+        <w:rPr>
+          <w:rFonts w:ascii="Arial" w:hAnsi="Arial" w:cs="Arial"/>
+        </w:rPr>
+      </w:pPr>
+      <w:r>
+        <w:rPr>
+          <w:rFonts w:ascii="Arial" w:hAnsi="Arial" w:cs="Arial"/>
+        </w:rPr>
+        <w:t xml:space="preserve">Angola. (2020). </w:t>
+      </w:r>
+      <w:r>
+        <w:rPr>
+          <w:rFonts w:ascii="Arial" w:hAnsi="Arial" w:cs="Arial"/>
+          <w:i/>
+          <w:iCs/>
+        </w:rPr>
+        <w:t>Lei n.º 41/20, de 23 de dezembro: Lei dos Contratos Públicos</w:t>
+      </w:r>
+      <w:r>
+        <w:rPr>
+          <w:rFonts w:ascii="Arial" w:hAnsi="Arial" w:cs="Arial"/>
+        </w:rPr>
+        <w:t xml:space="preserve">. Diário da República, </w:t>
+      </w:r>
+      <w:r>
+        <w:rPr>
+          <w:rFonts w:ascii="Arial" w:hAnsi="Arial" w:cs="Arial"/>
+        </w:rPr>
+        <w:t>I Série, n.º</w:t>
+      </w:r>
+      <w:r>
+        <w:rPr>
+          <w:rFonts w:ascii="Arial" w:hAnsi="Arial" w:cs="Arial"/>
+        </w:rPr>
+        <w:t xml:space="preserve"> </w:t>
+      </w:r>
+      <w:r>
+        <w:rPr>
+          <w:rFonts w:ascii="Arial" w:hAnsi="Arial" w:cs="Arial"/>
+        </w:rPr>
+        <w:t>204.</w:t>
+      </w:r>
+      <w:hyperlink r:id="rId16" w:history="1">
+        <w:r>
+          <w:rPr>
+            <w:rStyle w:val="Hiperligao"/>
+            <w:rFonts w:ascii="Arial" w:hAnsi="Arial" w:cs="Arial"/>
+          </w:rPr>
+          <w:t>https://www.ucm.minfin.gov.ao/cs/groups/public/documents/document/aw4x/mjy4/~edisp/minfin1268194.pdf</w:t>
+        </w:r>
+      </w:hyperlink>
+    </w:p>
+    <w:p>
+      <w:pPr>
+        <w:rPr>
+          <w:rFonts w:ascii="Arial" w:hAnsi="Arial" w:cs="Arial"/>
+          <w:lang w:val="pt-PT"/>
+        </w:rPr>
+      </w:pPr>
+      <w:r>
+        <w:rPr>
+          <w:rFonts w:ascii="Arial" w:hAnsi="Arial" w:cs="Arial"/>
+        </w:rPr>
+        <w:t>Ministério das Finanças. (2024). </w:t>
+      </w:r>
+      <w:r>
+        <w:rPr>
+          <w:rFonts w:ascii="Arial" w:hAnsi="Arial" w:cs="Arial"/>
+          <w:i/>
+          <w:iCs/>
+        </w:rPr>
+        <w:t>Portal da Contratação Pública</w:t>
+      </w:r>
+      <w:r>
+        <w:rPr>
+          <w:rFonts w:ascii="Arial" w:hAnsi="Arial" w:cs="Arial"/>
+        </w:rPr>
+        <w:t>. Governo de Angola. Recuperado de </w:t>
+      </w:r>
+      <w:hyperlink r:id="rId17" w:history="1">
+        <w:r>
+          <w:rPr>
+            <w:rStyle w:val="Hiperligao"/>
+            <w:rFonts w:ascii="Arial" w:hAnsi="Arial" w:cs="Arial"/>
+          </w:rPr>
+          <w:t>https://compraspublicas.minfin.gov.ao/</w:t>
+        </w:r>
+      </w:hyperlink>
+    </w:p>
+    <w:p>
+      <w:pPr>
+        <w:rPr>
+          <w:rFonts w:ascii="Arial" w:hAnsi="Arial" w:cs="Arial"/>
+          <w:lang w:val="pt-PT"/>
+        </w:rPr>
+      </w:pPr>
+      <w:r>
+        <w:rPr>
+          <w:rFonts w:ascii="Arial" w:hAnsi="Arial" w:cs="Arial"/>
+        </w:rPr>
+        <w:t>Serviço Nacional da Contratação Pública [SNCP]. (202</w:t>
+      </w:r>
+      <w:r>
+        <w:rPr>
+          <w:rFonts w:ascii="Arial" w:hAnsi="Arial" w:cs="Arial"/>
+        </w:rPr>
+        <w:t>6</w:t>
+      </w:r>
+      <w:r>
+        <w:rPr>
+          <w:rFonts w:ascii="Arial" w:hAnsi="Arial" w:cs="Arial"/>
+        </w:rPr>
+        <w:t>). </w:t>
+      </w:r>
+      <w:r>
+        <w:rPr>
+          <w:rFonts w:ascii="Arial" w:hAnsi="Arial" w:cs="Arial"/>
+          <w:i/>
+          <w:iCs/>
+        </w:rPr>
+        <w:t>Como se tornar fornecedor - Manual do Fornecedor</w:t>
+      </w:r>
+      <w:r>
+        <w:rPr>
+          <w:rFonts w:ascii="Arial" w:hAnsi="Arial" w:cs="Arial"/>
+        </w:rPr>
+        <w:t>. Ministério das Finanças. Recuperado de </w:t>
+      </w:r>
+      <w:hyperlink r:id="rId18" w:history="1">
+        <w:r>
+          <w:rPr>
+            <w:rStyle w:val="Hiperligao"/>
+            <w:rFonts w:ascii="Arial" w:hAnsi="Arial" w:cs="Arial"/>
+          </w:rPr>
+          <w:t>https://compraspublicas.minfin.gov.ao/</w:t>
+        </w:r>
+      </w:hyperlink>
     </w:p>
     <w:sectPr>
-      <w:headerReference w:type="even" r:id="rId14"/>
-      <w:headerReference w:type="default" r:id="rId15"/>
-      <w:footerReference w:type="even" r:id="rId16"/>
-      <w:footerReference w:type="default" r:id="rId17"/>
-      <w:headerReference w:type="first" r:id="rId18"/>
-      <w:footerReference w:type="first" r:id="rId19"/>
+      <w:headerReference w:type="even" r:id="rId19"/>
+      <w:headerReference w:type="default" r:id="rId20"/>
+      <w:footerReference w:type="even" r:id="rId21"/>
+      <w:footerReference w:type="default" r:id="rId22"/>
+      <w:headerReference w:type="first" r:id="rId23"/>
+      <w:footerReference w:type="first" r:id="rId24"/>
       <w:pgSz w:w="11906" w:h="16838"/>
       <w:pgMar w:top="1417" w:right="1701" w:bottom="1417" w:left="1701" w:header="708" w:footer="708" w:gutter="0"/>
       <w:cols w:space="708"/>
@@ -8432,7 +9168,6 @@
         <w:docPartUnique/>
       </w:docPartObj>
     </w:sdtPr>
-    <w:sdtEndPr/>
     <w:sdtContent>
       <w:p>
         <w:pPr>
@@ -10934,7 +11669,7 @@
   <w:style w:type="paragraph" w:default="1" w:styleId="Normal">
     <w:name w:val="Normal"/>
     <w:qFormat/>
-    <w:rsid w:val="00C15968"/>
+    <w:rsid w:val="00720E53"/>
   </w:style>
   <w:style w:type="paragraph" w:styleId="Ttulo1">
     <w:name w:val="heading 1"/>
@@ -11136,7 +11871,6 @@
   <w:style w:type="character" w:default="1" w:styleId="Tipodeletrapredefinidodopargrafo">
     <w:name w:val="Default Paragraph Font"/>
     <w:uiPriority w:val="1"/>
-    <w:semiHidden/>
     <w:unhideWhenUsed/>
   </w:style>
   <w:style w:type="table" w:default="1" w:styleId="Tabelanormal">
@@ -11609,6 +12343,185 @@
       <w:color w:val="0E2841" w:themeColor="text2"/>
       <w:sz w:val="18"/>
       <w:szCs w:val="18"/>
+    </w:rPr>
+  </w:style>
+  <w:style w:type="table" w:styleId="ListaClara-Cor3">
+    <w:name w:val="Light List Accent 3"/>
+    <w:basedOn w:val="Tabelanormal"/>
+    <w:uiPriority w:val="61"/>
+    <w:rsid w:val="00E709FB"/>
+    <w:pPr>
+      <w:spacing w:after="0" w:line="240" w:lineRule="auto"/>
+    </w:pPr>
+    <w:rPr>
+      <w:rFonts w:eastAsiaTheme="minorEastAsia"/>
+      <w:kern w:val="0"/>
+      <w:sz w:val="22"/>
+      <w:szCs w:val="22"/>
+      <w:lang w:eastAsia="pt-AO"/>
+      <w14:ligatures w14:val="none"/>
+    </w:rPr>
+    <w:tblPr>
+      <w:tblStyleRowBandSize w:val="1"/>
+      <w:tblStyleColBandSize w:val="1"/>
+      <w:tblBorders>
+        <w:top w:val="single" w:sz="8" w:space="0" w:color="196B24" w:themeColor="accent3"/>
+        <w:left w:val="single" w:sz="8" w:space="0" w:color="196B24" w:themeColor="accent3"/>
+        <w:bottom w:val="single" w:sz="8" w:space="0" w:color="196B24" w:themeColor="accent3"/>
+        <w:right w:val="single" w:sz="8" w:space="0" w:color="196B24" w:themeColor="accent3"/>
+      </w:tblBorders>
+    </w:tblPr>
+    <w:tblStylePr w:type="firstRow">
+      <w:pPr>
+        <w:spacing w:before="0" w:after="0" w:line="240" w:lineRule="auto"/>
+      </w:pPr>
+      <w:rPr>
+        <w:b/>
+        <w:bCs/>
+        <w:color w:val="FFFFFF" w:themeColor="background1"/>
+      </w:rPr>
+      <w:tblPr/>
+      <w:tcPr>
+        <w:shd w:val="clear" w:color="auto" w:fill="196B24" w:themeFill="accent3"/>
+      </w:tcPr>
+    </w:tblStylePr>
+    <w:tblStylePr w:type="lastRow">
+      <w:pPr>
+        <w:spacing w:before="0" w:after="0" w:line="240" w:lineRule="auto"/>
+      </w:pPr>
+      <w:rPr>
+        <w:b/>
+        <w:bCs/>
+      </w:rPr>
+      <w:tblPr/>
+      <w:tcPr>
+        <w:tcBorders>
+          <w:top w:val="double" w:sz="6" w:space="0" w:color="196B24" w:themeColor="accent3"/>
+          <w:left w:val="single" w:sz="8" w:space="0" w:color="196B24" w:themeColor="accent3"/>
+          <w:bottom w:val="single" w:sz="8" w:space="0" w:color="196B24" w:themeColor="accent3"/>
+          <w:right w:val="single" w:sz="8" w:space="0" w:color="196B24" w:themeColor="accent3"/>
+        </w:tcBorders>
+      </w:tcPr>
+    </w:tblStylePr>
+    <w:tblStylePr w:type="firstCol">
+      <w:rPr>
+        <w:b/>
+        <w:bCs/>
+      </w:rPr>
+    </w:tblStylePr>
+    <w:tblStylePr w:type="lastCol">
+      <w:rPr>
+        <w:b/>
+        <w:bCs/>
+      </w:rPr>
+    </w:tblStylePr>
+    <w:tblStylePr w:type="band1Vert">
+      <w:tblPr/>
+      <w:tcPr>
+        <w:tcBorders>
+          <w:top w:val="single" w:sz="8" w:space="0" w:color="196B24" w:themeColor="accent3"/>
+          <w:left w:val="single" w:sz="8" w:space="0" w:color="196B24" w:themeColor="accent3"/>
+          <w:bottom w:val="single" w:sz="8" w:space="0" w:color="196B24" w:themeColor="accent3"/>
+          <w:right w:val="single" w:sz="8" w:space="0" w:color="196B24" w:themeColor="accent3"/>
+        </w:tcBorders>
+      </w:tcPr>
+    </w:tblStylePr>
+    <w:tblStylePr w:type="band1Horz">
+      <w:tblPr/>
+      <w:tcPr>
+        <w:tcBorders>
+          <w:top w:val="single" w:sz="8" w:space="0" w:color="196B24" w:themeColor="accent3"/>
+          <w:left w:val="single" w:sz="8" w:space="0" w:color="196B24" w:themeColor="accent3"/>
+          <w:bottom w:val="single" w:sz="8" w:space="0" w:color="196B24" w:themeColor="accent3"/>
+          <w:right w:val="single" w:sz="8" w:space="0" w:color="196B24" w:themeColor="accent3"/>
+        </w:tcBorders>
+      </w:tcPr>
+    </w:tblStylePr>
+  </w:style>
+  <w:style w:type="table" w:styleId="TabeladeLista4">
+    <w:name w:val="List Table 4"/>
+    <w:basedOn w:val="Tabelanormal"/>
+    <w:uiPriority w:val="49"/>
+    <w:rsid w:val="00C72C39"/>
+    <w:pPr>
+      <w:spacing w:after="0" w:line="240" w:lineRule="auto"/>
+    </w:pPr>
+    <w:tblPr>
+      <w:tblStyleRowBandSize w:val="1"/>
+      <w:tblStyleColBandSize w:val="1"/>
+      <w:tblBorders>
+        <w:top w:val="single" w:sz="4" w:space="0" w:color="666666" w:themeColor="text1" w:themeTint="99"/>
+        <w:left w:val="single" w:sz="4" w:space="0" w:color="666666" w:themeColor="text1" w:themeTint="99"/>
+        <w:bottom w:val="single" w:sz="4" w:space="0" w:color="666666" w:themeColor="text1" w:themeTint="99"/>
+        <w:right w:val="single" w:sz="4" w:space="0" w:color="666666" w:themeColor="text1" w:themeTint="99"/>
+        <w:insideH w:val="single" w:sz="4" w:space="0" w:color="666666" w:themeColor="text1" w:themeTint="99"/>
+      </w:tblBorders>
+    </w:tblPr>
+    <w:tblStylePr w:type="firstRow">
+      <w:rPr>
+        <w:b/>
+        <w:bCs/>
+        <w:color w:val="FFFFFF" w:themeColor="background1"/>
+      </w:rPr>
+      <w:tblPr/>
+      <w:tcPr>
+        <w:tcBorders>
+          <w:top w:val="single" w:sz="4" w:space="0" w:color="000000" w:themeColor="text1"/>
+          <w:left w:val="single" w:sz="4" w:space="0" w:color="000000" w:themeColor="text1"/>
+          <w:bottom w:val="single" w:sz="4" w:space="0" w:color="000000" w:themeColor="text1"/>
+          <w:right w:val="single" w:sz="4" w:space="0" w:color="000000" w:themeColor="text1"/>
+          <w:insideH w:val="nil"/>
+        </w:tcBorders>
+        <w:shd w:val="clear" w:color="auto" w:fill="000000" w:themeFill="text1"/>
+      </w:tcPr>
+    </w:tblStylePr>
+    <w:tblStylePr w:type="lastRow">
+      <w:rPr>
+        <w:b/>
+        <w:bCs/>
+      </w:rPr>
+      <w:tblPr/>
+      <w:tcPr>
+        <w:tcBorders>
+          <w:top w:val="double" w:sz="4" w:space="0" w:color="666666" w:themeColor="text1" w:themeTint="99"/>
+        </w:tcBorders>
+      </w:tcPr>
+    </w:tblStylePr>
+    <w:tblStylePr w:type="firstCol">
+      <w:rPr>
+        <w:b/>
+        <w:bCs/>
+      </w:rPr>
+    </w:tblStylePr>
+    <w:tblStylePr w:type="lastCol">
+      <w:rPr>
+        <w:b/>
+        <w:bCs/>
+      </w:rPr>
+    </w:tblStylePr>
+    <w:tblStylePr w:type="band1Vert">
+      <w:tblPr/>
+      <w:tcPr>
+        <w:shd w:val="clear" w:color="auto" w:fill="CCCCCC" w:themeFill="text1" w:themeFillTint="33"/>
+      </w:tcPr>
+    </w:tblStylePr>
+    <w:tblStylePr w:type="band1Horz">
+      <w:tblPr/>
+      <w:tcPr>
+        <w:shd w:val="clear" w:color="auto" w:fill="CCCCCC" w:themeFill="text1" w:themeFillTint="33"/>
+      </w:tcPr>
+    </w:tblStylePr>
+  </w:style>
+  <w:style w:type="character" w:styleId="Hiperligaovisitada">
+    <w:name w:val="FollowedHyperlink"/>
+    <w:basedOn w:val="Tipodeletrapredefinidodopargrafo"/>
+    <w:uiPriority w:val="99"/>
+    <w:semiHidden/>
+    <w:unhideWhenUsed/>
+    <w:rsid w:val="00B9105F"/>
+    <w:rPr>
+      <w:color w:val="96607D" w:themeColor="followedHyperlink"/>
+      <w:u w:val="single"/>
     </w:rPr>
   </w:style>
 </w:styles>

</xml_diff>